<commit_message>
Continue separation JSON and Bridge
</commit_message>
<xml_diff>
--- a/Experts/Anhnt/Document/MQL5 Note/2026 0731 JSON Sepration Plan.docx
+++ b/Experts/Anhnt/Document/MQL5 Note/2026 0731 JSON Sepration Plan.docx
@@ -4,7 +4,10 @@
   <w:body>
     <w:p>
       <w:r>
-        <w:t xml:space="preserve">. </w:t>
+        <w:t>1.</w:t>
+      </w:r>
+      <w:r>
+        <w:t xml:space="preserve"> </w:t>
       </w:r>
       <w:r>
         <w:rPr>
@@ -138,7 +141,7 @@
     <w:p>
       <w:r>
         <w:pict w14:anchorId="245E887B">
-          <v:rect id="_x0000_i1031" style="width:345.3pt;height:.75pt" o:hrpct="0" o:hralign="center" o:hrstd="t" o:hr="t" fillcolor="#a0a0a0" stroked="f"/>
+          <v:rect id="_x0000_i1025" style="width:345.3pt;height:.75pt" o:hrpct="0" o:hralign="center" o:hrstd="t" o:hr="t" fillcolor="#a0a0a0" stroked="f"/>
         </w:pict>
       </w:r>
     </w:p>
@@ -254,6 +257,1303 @@
     <w:p>
       <w:r>
         <w:t>Class này sẽ parse JSON thực thụ (hoặc quản lý các string block tập trung) để bảo đảm an toàn.</w:t>
+      </w:r>
+    </w:p>
+    <w:p>
+      <w:pPr>
+        <w:pStyle w:val="Heading1"/>
+      </w:pPr>
+      <w:r>
+        <w:t>Tách Service</w:t>
+      </w:r>
+    </w:p>
+    <w:p>
+      <w:pPr>
+        <w:pStyle w:val="Heading2"/>
+      </w:pPr>
+      <w:r>
+        <w:t>SignalLogger</w:t>
+      </w:r>
+    </w:p>
+    <w:p>
+      <w:pPr>
+        <w:rPr>
+          <w:lang w:val="fr-FR"/>
+        </w:rPr>
+      </w:pPr>
+      <w:r>
+        <w:rPr>
+          <w:lang w:val="fr-FR"/>
+        </w:rPr>
+        <w:t xml:space="preserve">      </w:t>
+      </w:r>
+      <w:r>
+        <w:rPr>
+          <w:lang w:val="fr-FR"/>
+        </w:rPr>
+        <w:t>Thuộc CGUIPannel như m_signal_logger.</w:t>
+      </w:r>
+    </w:p>
+    <w:p>
+      <w:r>
+        <w:t xml:space="preserve">     </w:t>
+      </w:r>
+      <w:r>
+        <w:t xml:space="preserve"> </w:t>
+      </w:r>
+      <w:r>
+        <w:t>Dùng trong CGUIPannel::CheckIndicatorAlerts().</w:t>
+      </w:r>
+    </w:p>
+    <w:p>
+      <w:r>
+        <w:t xml:space="preserve">     </w:t>
+      </w:r>
+      <w:r>
+        <w:t>Chức năng:</w:t>
+      </w:r>
+    </w:p>
+    <w:p>
+      <w:pPr>
+        <w:numPr>
+          <w:ilvl w:val="0"/>
+          <w:numId w:val="5"/>
+        </w:numPr>
+      </w:pPr>
+      <w:r>
+        <w:t>LoadSignalLogWatermarks() đọc watermark từ file JSON.</w:t>
+      </w:r>
+    </w:p>
+    <w:p>
+      <w:pPr>
+        <w:numPr>
+          <w:ilvl w:val="0"/>
+          <w:numId w:val="5"/>
+        </w:numPr>
+      </w:pPr>
+      <w:r>
+        <w:t>WriteSignalLogRow(...) ghi dòng vào Signal_Log.csv.</w:t>
+      </w:r>
+    </w:p>
+    <w:p>
+      <w:pPr>
+        <w:numPr>
+          <w:ilvl w:val="0"/>
+          <w:numId w:val="5"/>
+        </w:numPr>
+      </w:pPr>
+      <w:r>
+        <w:t>SetSignalLogWatermark() cập nhật watermark để không ghi lại lịch sử cũ.</w:t>
+      </w:r>
+    </w:p>
+    <w:p>
+      <w:r>
+        <w:t xml:space="preserve">    </w:t>
+      </w:r>
+      <w:r>
+        <w:t>Ý nghĩa:</w:t>
+      </w:r>
+    </w:p>
+    <w:p>
+      <w:pPr>
+        <w:numPr>
+          <w:ilvl w:val="1"/>
+          <w:numId w:val="5"/>
+        </w:numPr>
+      </w:pPr>
+      <w:r>
+        <w:t>Log cả signal “Closed” và “Live”.</w:t>
+      </w:r>
+    </w:p>
+    <w:p>
+      <w:pPr>
+        <w:numPr>
+          <w:ilvl w:val="1"/>
+          <w:numId w:val="5"/>
+        </w:numPr>
+      </w:pPr>
+      <w:r>
+        <w:t>Giữ có trạng thái watermark để chỉ append những signal mới đã commit.</w:t>
+      </w:r>
+    </w:p>
+    <w:p>
+      <w:pPr>
+        <w:pStyle w:val="Heading2"/>
+      </w:pPr>
+      <w:r>
+        <w:t>SignalBridgeWriter</w:t>
+      </w:r>
+    </w:p>
+    <w:p>
+      <w:pPr>
+        <w:numPr>
+          <w:ilvl w:val="0"/>
+          <w:numId w:val="5"/>
+        </w:numPr>
+      </w:pPr>
+      <w:r>
+        <w:t>Thuộc CGUIPannel như m_bridge_writer.</w:t>
+      </w:r>
+    </w:p>
+    <w:p>
+      <w:pPr>
+        <w:numPr>
+          <w:ilvl w:val="0"/>
+          <w:numId w:val="5"/>
+        </w:numPr>
+      </w:pPr>
+      <w:r>
+        <w:t>Được Initialize(...) khi CGUIPannel đã nhận đủ:</w:t>
+      </w:r>
+    </w:p>
+    <w:p>
+      <w:pPr>
+        <w:numPr>
+          <w:ilvl w:val="1"/>
+          <w:numId w:val="5"/>
+        </w:numPr>
+      </w:pPr>
+      <w:r>
+        <w:t>CTimeSeriesEngine, CIndicatorsCollection, CBarTimeSeriesCollection, và this làm ITemplateBuySellProvider.</w:t>
+      </w:r>
+    </w:p>
+    <w:p>
+      <w:pPr>
+        <w:numPr>
+          <w:ilvl w:val="0"/>
+          <w:numId w:val="5"/>
+        </w:numPr>
+      </w:pPr>
+      <w:r>
+        <w:t>Chức năng:</w:t>
+      </w:r>
+    </w:p>
+    <w:p>
+      <w:pPr>
+        <w:numPr>
+          <w:ilvl w:val="1"/>
+          <w:numId w:val="5"/>
+        </w:numPr>
+      </w:pPr>
+      <w:r>
+        <w:lastRenderedPageBreak/>
+        <w:t>BuildAndWriteSignalBridge() quét indicator template, lấy signal từ Layer 1, lọc bằng TemplateBuySellFor(...), sau đó ghi dữ liệu bridge vào file.</w:t>
+      </w:r>
+    </w:p>
+    <w:p>
+      <w:pPr>
+        <w:numPr>
+          <w:ilvl w:val="1"/>
+          <w:numId w:val="5"/>
+        </w:numPr>
+      </w:pPr>
+      <w:r>
+        <w:t>ResetSignalBridge() reset watermark thời gian và rebuild lại file.</w:t>
+      </w:r>
+    </w:p>
+    <w:p>
+      <w:pPr>
+        <w:numPr>
+          <w:ilvl w:val="0"/>
+          <w:numId w:val="5"/>
+        </w:numPr>
+      </w:pPr>
+      <w:r>
+        <w:t>Ý nghĩa:</w:t>
+      </w:r>
+    </w:p>
+    <w:p>
+      <w:pPr>
+        <w:numPr>
+          <w:ilvl w:val="1"/>
+          <w:numId w:val="5"/>
+        </w:numPr>
+      </w:pPr>
+      <w:r>
+        <w:t>Tạo “signal bridge” từ dữ liệu indicator + template buy/sell.</w:t>
+      </w:r>
+    </w:p>
+    <w:p>
+      <w:pPr>
+        <w:numPr>
+          <w:ilvl w:val="1"/>
+          <w:numId w:val="5"/>
+        </w:numPr>
+      </w:pPr>
+      <w:r>
+        <w:t>Dùng khi checkbox thay đổi hoặc khi cần tái xuất file bridge.</w:t>
+      </w:r>
+    </w:p>
+    <w:p>
+      <w:pPr>
+        <w:rPr>
+          <w:b/>
+          <w:bCs/>
+        </w:rPr>
+      </w:pPr>
+      <w:r>
+        <w:rPr>
+          <w:b/>
+          <w:bCs/>
+        </w:rPr>
+        <w:t>Ai cung cấp dữ liệu?</w:t>
+      </w:r>
+    </w:p>
+    <w:p>
+      <w:pPr>
+        <w:numPr>
+          <w:ilvl w:val="0"/>
+          <w:numId w:val="6"/>
+        </w:numPr>
+      </w:pPr>
+      <w:r>
+        <w:t>CGUIPannel implements ITemplateBuySellProvider.</w:t>
+      </w:r>
+    </w:p>
+    <w:p>
+      <w:pPr>
+        <w:numPr>
+          <w:ilvl w:val="0"/>
+          <w:numId w:val="6"/>
+        </w:numPr>
+      </w:pPr>
+      <w:r>
+        <w:t>SignalBridgeWriter gọi TemplateBuySellFor(ind, buy, sell) để biết template hiện tại có bật Buy/Sell không.</w:t>
+      </w:r>
+    </w:p>
+    <w:p>
+      <w:pPr>
+        <w:rPr>
+          <w:b/>
+          <w:bCs/>
+        </w:rPr>
+      </w:pPr>
+      <w:r>
+        <w:rPr>
+          <w:b/>
+          <w:bCs/>
+        </w:rPr>
+        <w:t>Nên dùng nó như thế nào</w:t>
+      </w:r>
+    </w:p>
+    <w:p>
+      <w:pPr>
+        <w:numPr>
+          <w:ilvl w:val="0"/>
+          <w:numId w:val="7"/>
+        </w:numPr>
+      </w:pPr>
+      <w:r>
+        <w:t>SignalLogger dùng để lưu lịch sử và xuất CSV/alerts.</w:t>
+      </w:r>
+    </w:p>
+    <w:p>
+      <w:pPr>
+        <w:numPr>
+          <w:ilvl w:val="0"/>
+          <w:numId w:val="7"/>
+        </w:numPr>
+      </w:pPr>
+      <w:r>
+        <w:t>SignalBridgeWriter dùng để sinh dữ liệu bridge dựa trên template và signal hiện tại.</w:t>
+      </w:r>
+    </w:p>
+    <w:p>
+      <w:pPr>
+        <w:numPr>
+          <w:ilvl w:val="0"/>
+          <w:numId w:val="7"/>
+        </w:numPr>
+      </w:pPr>
+      <w:r>
+        <w:t>Cả hai chạy trong vòng OnTimerEvent/refresh GUI, không phải do user trực tiếp nhấn nút.</w:t>
+      </w:r>
+    </w:p>
+    <w:p>
+      <w:r>
+        <w:t>Nếu bạn muốn, mình có thể tóm tắt thêm:</w:t>
+      </w:r>
+    </w:p>
+    <w:p>
+      <w:pPr>
+        <w:numPr>
+          <w:ilvl w:val="0"/>
+          <w:numId w:val="8"/>
+        </w:numPr>
+      </w:pPr>
+      <w:r>
+        <w:t>dòng nào gọi BuildAndWriteSignalBridge(),</w:t>
+      </w:r>
+    </w:p>
+    <w:p>
+      <w:pPr>
+        <w:numPr>
+          <w:ilvl w:val="0"/>
+          <w:numId w:val="8"/>
+        </w:numPr>
+      </w:pPr>
+      <w:r>
+        <w:t>dòng nào gọi WriteSignalLogRow(),</w:t>
+      </w:r>
+    </w:p>
+    <w:p>
+      <w:pPr>
+        <w:numPr>
+          <w:ilvl w:val="0"/>
+          <w:numId w:val="8"/>
+        </w:numPr>
+      </w:pPr>
+      <w:r>
+        <w:t>và khi nào ResetSignalBridge() được kích hoạt.</w:t>
+      </w:r>
+    </w:p>
+    <w:p>
+      <w:pPr>
+        <w:pStyle w:val="Heading1"/>
+      </w:pPr>
+      <w:r>
+        <w:t>Chuyển vào Service của Lib</w:t>
+      </w:r>
+    </w:p>
+    <w:p>
+      <w:pPr>
+        <w:numPr>
+          <w:ilvl w:val="0"/>
+          <w:numId w:val="9"/>
+        </w:numPr>
+      </w:pPr>
+      <w:r>
+        <w:t>CSignalLogger và CSignalBridgeWriter</w:t>
+      </w:r>
+    </w:p>
+    <w:p>
+      <w:pPr>
+        <w:numPr>
+          <w:ilvl w:val="1"/>
+          <w:numId w:val="9"/>
+        </w:numPr>
+      </w:pPr>
+      <w:r>
+        <w:t>Hiện tại là helper/utility của </w:t>
+      </w:r>
+      <w:hyperlink r:id="rId5" w:history="1">
+        <w:r>
+          <w:rPr>
+            <w:rStyle w:val="Hyperlink"/>
+          </w:rPr>
+          <w:t>V8</w:t>
+        </w:r>
+      </w:hyperlink>
+      <w:r>
+        <w:t> trong EA.</w:t>
+      </w:r>
+    </w:p>
+    <w:p>
+      <w:pPr>
+        <w:numPr>
+          <w:ilvl w:val="1"/>
+          <w:numId w:val="9"/>
+        </w:numPr>
+      </w:pPr>
+      <w:r>
+        <w:t>Chúng phụ thuộc trực tiếp vào tầng GUI/engine của V8:</w:t>
+      </w:r>
+    </w:p>
+    <w:p>
+      <w:pPr>
+        <w:numPr>
+          <w:ilvl w:val="2"/>
+          <w:numId w:val="9"/>
+        </w:numPr>
+      </w:pPr>
+      <w:r>
+        <w:t>SignalBridgeWriter cần ITemplateBuySellProvider, CTimeSeriesEngine, CIndicatorsCollection, CBarTimeSeriesCollection</w:t>
+      </w:r>
+    </w:p>
+    <w:p>
+      <w:pPr>
+        <w:numPr>
+          <w:ilvl w:val="2"/>
+          <w:numId w:val="9"/>
+        </w:numPr>
+      </w:pPr>
+      <w:r>
+        <w:t>SignalLogger phụ thuộc vào file config của indicator và dùng cả cơ chế watermark/log riêng</w:t>
+      </w:r>
+    </w:p>
+    <w:p>
+      <w:pPr>
+        <w:numPr>
+          <w:ilvl w:val="1"/>
+          <w:numId w:val="9"/>
+        </w:numPr>
+      </w:pPr>
+      <w:r>
+        <w:lastRenderedPageBreak/>
+        <w:t>Nếu mục tiêu của bạn là gom các service chung dùng cho nhiều phiên bản EA, thì chuyển được.</w:t>
+      </w:r>
+    </w:p>
+    <w:p>
+      <w:pPr>
+        <w:numPr>
+          <w:ilvl w:val="1"/>
+          <w:numId w:val="9"/>
+        </w:numPr>
+      </w:pPr>
+      <w:r>
+        <w:t>Nhưng nếu Combination Lib/Services chỉ là thư viện chung, mình thấy SignalBridgeWriter hơi đặc thù V8, nên cân nhắc giữ lại trong </w:t>
+      </w:r>
+      <w:hyperlink r:id="rId6" w:history="1">
+        <w:r>
+          <w:rPr>
+            <w:rStyle w:val="Hyperlink"/>
+          </w:rPr>
+          <w:t>Services</w:t>
+        </w:r>
+      </w:hyperlink>
+      <w:r>
+        <w:t> nếu không muốn tạo dependency lộn xộn.</w:t>
+      </w:r>
+    </w:p>
+    <w:p>
+      <w:pPr>
+        <w:numPr>
+          <w:ilvl w:val="0"/>
+          <w:numId w:val="9"/>
+        </w:numPr>
+      </w:pPr>
+      <w:hyperlink r:id="rId7" w:history="1">
+        <w:r>
+          <w:rPr>
+            <w:rStyle w:val="Hyperlink"/>
+          </w:rPr>
+          <w:t>IndicatorConfigLoader.mqh</w:t>
+        </w:r>
+      </w:hyperlink>
+    </w:p>
+    <w:p>
+      <w:pPr>
+        <w:numPr>
+          <w:ilvl w:val="1"/>
+          <w:numId w:val="9"/>
+        </w:numPr>
+        <w:rPr>
+          <w:lang w:val="fr-FR"/>
+        </w:rPr>
+      </w:pPr>
+      <w:r>
+        <w:rPr>
+          <w:lang w:val="fr-FR"/>
+        </w:rPr>
+        <w:t>Đây gần như là parser config, có thể xem là service chung hơn.</w:t>
+      </w:r>
+    </w:p>
+    <w:p>
+      <w:pPr>
+        <w:numPr>
+          <w:ilvl w:val="1"/>
+          <w:numId w:val="9"/>
+        </w:numPr>
+        <w:rPr>
+          <w:lang w:val="fr-FR"/>
+        </w:rPr>
+      </w:pPr>
+      <w:r>
+        <w:rPr>
+          <w:lang w:val="fr-FR"/>
+        </w:rPr>
+        <w:t>Nếu bạn muốn dùng chung cho nhiều module/phiên bản, chuyển vào Combination Lib/Services hợp lý hơn.</w:t>
+      </w:r>
+    </w:p>
+    <w:p>
+      <w:pPr>
+        <w:numPr>
+          <w:ilvl w:val="1"/>
+          <w:numId w:val="9"/>
+        </w:numPr>
+        <w:rPr>
+          <w:lang w:val="fr-FR"/>
+        </w:rPr>
+      </w:pPr>
+      <w:r>
+        <w:rPr>
+          <w:lang w:val="fr-FR"/>
+        </w:rPr>
+        <w:t>Nhưng vì format config hiện tại là riêng EA này, cần chắc là nó thật sự “generic” trước khi move.</w:t>
+      </w:r>
+    </w:p>
+    <w:p>
+      <w:pPr>
+        <w:rPr>
+          <w:b/>
+          <w:bCs/>
+        </w:rPr>
+      </w:pPr>
+      <w:r>
+        <w:rPr>
+          <w:b/>
+          <w:bCs/>
+        </w:rPr>
+        <w:t>Nếu chuyển</w:t>
+      </w:r>
+    </w:p>
+    <w:p>
+      <w:pPr>
+        <w:numPr>
+          <w:ilvl w:val="0"/>
+          <w:numId w:val="10"/>
+        </w:numPr>
+      </w:pPr>
+      <w:r>
+        <w:t>phải sửa include path:</w:t>
+      </w:r>
+    </w:p>
+    <w:p>
+      <w:pPr>
+        <w:numPr>
+          <w:ilvl w:val="1"/>
+          <w:numId w:val="10"/>
+        </w:numPr>
+      </w:pPr>
+      <w:hyperlink r:id="rId8" w:history="1">
+        <w:r>
+          <w:rPr>
+            <w:rStyle w:val="Hyperlink"/>
+          </w:rPr>
+          <w:t>SignalLogger.mqh</w:t>
+        </w:r>
+      </w:hyperlink>
+      <w:r>
+        <w:t> hiện #include "..\Artyom Trishkin\IndicatorConfigLoader.mqh"</w:t>
+      </w:r>
+    </w:p>
+    <w:p>
+      <w:pPr>
+        <w:numPr>
+          <w:ilvl w:val="1"/>
+          <w:numId w:val="10"/>
+        </w:numPr>
+      </w:pPr>
+      <w:r>
+        <w:t>sau khi chuyển, đường dẫn tương đối sẽ khác</w:t>
+      </w:r>
+    </w:p>
+    <w:p>
+      <w:pPr>
+        <w:numPr>
+          <w:ilvl w:val="0"/>
+          <w:numId w:val="10"/>
+        </w:numPr>
+      </w:pPr>
+      <w:r>
+        <w:t>phải kiểm tra lại:</w:t>
+      </w:r>
+    </w:p>
+    <w:p>
+      <w:pPr>
+        <w:numPr>
+          <w:ilvl w:val="1"/>
+          <w:numId w:val="10"/>
+        </w:numPr>
+      </w:pPr>
+      <w:hyperlink r:id="rId9" w:history="1">
+        <w:r>
+          <w:rPr>
+            <w:rStyle w:val="Hyperlink"/>
+          </w:rPr>
+          <w:t>GUIPannel.mqh</w:t>
+        </w:r>
+      </w:hyperlink>
+      <w:r>
+        <w:t> include ..\Services\SignalLogger.mqh và ..\Services\SignalBridgeWriter.mqh</w:t>
+      </w:r>
+    </w:p>
+    <w:p>
+      <w:pPr>
+        <w:numPr>
+          <w:ilvl w:val="1"/>
+          <w:numId w:val="10"/>
+        </w:numPr>
+      </w:pPr>
+      <w:hyperlink r:id="rId10" w:history="1">
+        <w:r>
+          <w:rPr>
+            <w:rStyle w:val="Hyperlink"/>
+          </w:rPr>
+          <w:t>TimeSeriesEngine.mqh</w:t>
+        </w:r>
+      </w:hyperlink>
+      <w:r>
+        <w:t> include </w:t>
+      </w:r>
+      <w:hyperlink r:id="rId11" w:history="1">
+        <w:r>
+          <w:rPr>
+            <w:rStyle w:val="Hyperlink"/>
+          </w:rPr>
+          <w:t>IndicatorConfigLoader.mqh</w:t>
+        </w:r>
+      </w:hyperlink>
+    </w:p>
+    <w:p>
+      <w:pPr>
+        <w:pStyle w:val="Heading1"/>
+      </w:pPr>
+      <w:r>
+        <w:t>CTimeSeriesEngine *m_engine</w:t>
+      </w:r>
+      <w:r>
+        <w:t xml:space="preserve"> trong </w:t>
+      </w:r>
+      <w:r>
+        <w:t>CSignalBridgeWriter </w:t>
+      </w:r>
+    </w:p>
+    <w:p>
+      <w:pPr>
+        <w:numPr>
+          <w:ilvl w:val="0"/>
+          <w:numId w:val="11"/>
+        </w:numPr>
+      </w:pPr>
+      <w:r>
+        <w:t>CSignalBridgeWriter hiện giữ:</w:t>
+      </w:r>
+    </w:p>
+    <w:p>
+      <w:pPr>
+        <w:numPr>
+          <w:ilvl w:val="1"/>
+          <w:numId w:val="11"/>
+        </w:numPr>
+      </w:pPr>
+      <w:r>
+        <w:t>CTimeSeriesEngine *m_engine</w:t>
+      </w:r>
+    </w:p>
+    <w:p>
+      <w:pPr>
+        <w:numPr>
+          <w:ilvl w:val="0"/>
+          <w:numId w:val="11"/>
+        </w:numPr>
+      </w:pPr>
+      <w:r>
+        <w:t>nhưng trong code nó chỉ dùng đúng một chỗ:</w:t>
+      </w:r>
+    </w:p>
+    <w:p>
+      <w:pPr>
+        <w:numPr>
+          <w:ilvl w:val="1"/>
+          <w:numId w:val="11"/>
+        </w:numPr>
+      </w:pPr>
+      <w:r>
+        <w:t>m_engine.GetSignalsCollection().GetOrCreateSignal(ind);</w:t>
+      </w:r>
+    </w:p>
+    <w:p>
+      <w:r>
+        <w:t>Điều đó nghĩa là CSignalBridgeWriter đang phụ thuộc vào cả CTimeSeriesEngine chỉ để lấy CSignalsCollection.</w:t>
+      </w:r>
+    </w:p>
+    <w:p>
+      <w:pPr>
+        <w:rPr>
+          <w:b/>
+          <w:bCs/>
+        </w:rPr>
+      </w:pPr>
+      <w:r>
+        <w:rPr>
+          <w:b/>
+          <w:bCs/>
+        </w:rPr>
+        <w:t>Đề xuất tốt hơn</w:t>
+      </w:r>
+    </w:p>
+    <w:p>
+      <w:r>
+        <w:lastRenderedPageBreak/>
+        <w:t>Thay vì truyền nguyên CTimeSeriesEngine*, nên truyền thẳng:</w:t>
+      </w:r>
+    </w:p>
+    <w:p>
+      <w:pPr>
+        <w:numPr>
+          <w:ilvl w:val="0"/>
+          <w:numId w:val="12"/>
+        </w:numPr>
+      </w:pPr>
+      <w:r>
+        <w:t>CSignalsCollection *m_signals hoặc</w:t>
+      </w:r>
+    </w:p>
+    <w:p>
+      <w:pPr>
+        <w:numPr>
+          <w:ilvl w:val="0"/>
+          <w:numId w:val="12"/>
+        </w:numPr>
+      </w:pPr>
+      <w:r>
+        <w:t>CSignalsCollection &amp;</w:t>
+      </w:r>
+    </w:p>
+    <w:p>
+      <w:r>
+        <w:t>và gọi:</w:t>
+      </w:r>
+    </w:p>
+    <w:p>
+      <w:pPr>
+        <w:numPr>
+          <w:ilvl w:val="0"/>
+          <w:numId w:val="13"/>
+        </w:numPr>
+      </w:pPr>
+      <w:r>
+        <w:t>m_signals.GetOrCreateSignal(ind);</w:t>
+      </w:r>
+    </w:p>
+    <w:p>
+      <w:pPr>
+        <w:rPr>
+          <w:b/>
+          <w:bCs/>
+        </w:rPr>
+      </w:pPr>
+      <w:r>
+        <w:rPr>
+          <w:b/>
+          <w:bCs/>
+        </w:rPr>
+        <w:t>Lợi ích</w:t>
+      </w:r>
+    </w:p>
+    <w:p>
+      <w:pPr>
+        <w:numPr>
+          <w:ilvl w:val="0"/>
+          <w:numId w:val="14"/>
+        </w:numPr>
+      </w:pPr>
+      <w:r>
+        <w:t>Giảm coupling giữa SignalBridgeWriter và TimeSeriesEngine</w:t>
+      </w:r>
+    </w:p>
+    <w:p>
+      <w:pPr>
+        <w:numPr>
+          <w:ilvl w:val="0"/>
+          <w:numId w:val="14"/>
+        </w:numPr>
+      </w:pPr>
+      <w:r>
+        <w:t>Biểu thị rõ ràng dependency: module này cần signals, không cần toàn bộ engine</w:t>
+      </w:r>
+    </w:p>
+    <w:p>
+      <w:pPr>
+        <w:numPr>
+          <w:ilvl w:val="0"/>
+          <w:numId w:val="14"/>
+        </w:numPr>
+      </w:pPr>
+      <w:r>
+        <w:t>Dễ test hơn nếu sau này muốn mock/ thay thế CSignalsCollection</w:t>
+      </w:r>
+    </w:p>
+    <w:p>
+      <w:pPr>
+        <w:rPr>
+          <w:b/>
+          <w:bCs/>
+        </w:rPr>
+      </w:pPr>
+      <w:r>
+        <w:rPr>
+          <w:b/>
+          <w:bCs/>
+        </w:rPr>
+        <w:t>Nên sửa như sau</w:t>
+      </w:r>
+    </w:p>
+    <w:p>
+      <w:pPr>
+        <w:numPr>
+          <w:ilvl w:val="0"/>
+          <w:numId w:val="15"/>
+        </w:numPr>
+      </w:pPr>
+      <w:r>
+        <w:t>SignalBridgeWriter:</w:t>
+      </w:r>
+    </w:p>
+    <w:p>
+      <w:pPr>
+        <w:numPr>
+          <w:ilvl w:val="1"/>
+          <w:numId w:val="15"/>
+        </w:numPr>
+      </w:pPr>
+      <w:r>
+        <w:t>thêm CSignalsCollection *m_signals;</w:t>
+      </w:r>
+    </w:p>
+    <w:p>
+      <w:pPr>
+        <w:numPr>
+          <w:ilvl w:val="1"/>
+          <w:numId w:val="15"/>
+        </w:numPr>
+      </w:pPr>
+      <w:r>
+        <w:t>xóa m_engine nếu không dùng chỗ khác</w:t>
+      </w:r>
+    </w:p>
+    <w:p>
+      <w:pPr>
+        <w:numPr>
+          <w:ilvl w:val="0"/>
+          <w:numId w:val="15"/>
+        </w:numPr>
+      </w:pPr>
+      <w:r>
+        <w:t>Initialize(...):</w:t>
+      </w:r>
+    </w:p>
+    <w:p>
+      <w:pPr>
+        <w:numPr>
+          <w:ilvl w:val="1"/>
+          <w:numId w:val="15"/>
+        </w:numPr>
+      </w:pPr>
+      <w:r>
+        <w:t>nhận CSignalsCollection *signals thay vì CTimeSeriesEngine *engine</w:t>
+      </w:r>
+    </w:p>
+    <w:p>
+      <w:pPr>
+        <w:numPr>
+          <w:ilvl w:val="0"/>
+          <w:numId w:val="15"/>
+        </w:numPr>
+      </w:pPr>
+      <w:r>
+        <w:t>CGUIPannel::SetTimeSeriesEngine(...) hoặc nơi khởi tạo bridge:</w:t>
+      </w:r>
+    </w:p>
+    <w:p>
+      <w:pPr>
+        <w:numPr>
+          <w:ilvl w:val="1"/>
+          <w:numId w:val="15"/>
+        </w:numPr>
+      </w:pPr>
+      <w:r>
+        <w:t>chuyển m_time_series_engine-&gt;GetSignalsCollection() vào Initialize</w:t>
+      </w:r>
+    </w:p>
+    <w:p>
+      <w:pPr>
+        <w:rPr>
+          <w:b/>
+          <w:bCs/>
+        </w:rPr>
+      </w:pPr>
+      <w:r>
+        <w:rPr>
+          <w:b/>
+          <w:bCs/>
+        </w:rPr>
+        <w:t>Lưu ý</w:t>
+      </w:r>
+    </w:p>
+    <w:p>
+      <w:pPr>
+        <w:numPr>
+          <w:ilvl w:val="0"/>
+          <w:numId w:val="16"/>
+        </w:numPr>
+      </w:pPr>
+      <w:r>
+        <w:t>Chỉ làm khi bạn chắc SignalBridgeWriter không cần thêm API khác của engine.</w:t>
+      </w:r>
+    </w:p>
+    <w:p>
+      <w:pPr>
+        <w:numPr>
+          <w:ilvl w:val="0"/>
+          <w:numId w:val="16"/>
+        </w:numPr>
+      </w:pPr>
+      <w:r>
+        <w:t>Nếu tương lai vẫn cần engine để mở rộng, có thể giữ m_engine như fallback, nhưng hiện tại nó là dependency dư thừa.</w:t>
+      </w:r>
+    </w:p>
+    <w:p>
+      <w:r>
+        <w:t>Nói tóm lại:</w:t>
+      </w:r>
+    </w:p>
+    <w:p>
+      <w:r>
+        <w:t>Đúng, nên tách m_engine ra thành m_signals nếu mục đích duy nhất là lấy CSignalsCollection.</w:t>
+      </w:r>
+    </w:p>
+    <w:p>
+      <w:pPr>
+        <w:pStyle w:val="Heading1"/>
+      </w:pPr>
+      <w:r>
+        <w:t>Fjalkfjla</w:t>
+      </w:r>
+    </w:p>
+    <w:p>
+      <w:r>
+        <w:t>Không, mình nghĩ không nên merge nguyên các method của CSignalBridgeWriter vào CSignalsCollection.</w:t>
+      </w:r>
+    </w:p>
+    <w:p>
+      <w:pPr>
+        <w:rPr>
+          <w:b/>
+          <w:bCs/>
+        </w:rPr>
+      </w:pPr>
+      <w:r>
+        <w:rPr>
+          <w:b/>
+          <w:bCs/>
+        </w:rPr>
+        <w:lastRenderedPageBreak/>
+        <w:t>Tại sao không nên</w:t>
+      </w:r>
+    </w:p>
+    <w:p>
+      <w:pPr>
+        <w:numPr>
+          <w:ilvl w:val="0"/>
+          <w:numId w:val="17"/>
+        </w:numPr>
+      </w:pPr>
+      <w:r>
+        <w:t>CSignalsCollection đã có trách nhiệm rõ:</w:t>
+      </w:r>
+    </w:p>
+    <w:p>
+      <w:pPr>
+        <w:numPr>
+          <w:ilvl w:val="1"/>
+          <w:numId w:val="17"/>
+        </w:numPr>
+      </w:pPr>
+      <w:r>
+        <w:t>quản lý lifecycle của CSignalBase</w:t>
+      </w:r>
+    </w:p>
+    <w:p>
+      <w:pPr>
+        <w:numPr>
+          <w:ilvl w:val="1"/>
+          <w:numId w:val="17"/>
+        </w:numPr>
+      </w:pPr>
+      <w:r>
+        <w:t>lookup / tạo signal cho indicator</w:t>
+      </w:r>
+    </w:p>
+    <w:p>
+      <w:pPr>
+        <w:numPr>
+          <w:ilvl w:val="1"/>
+          <w:numId w:val="17"/>
+        </w:numPr>
+      </w:pPr>
+      <w:r>
+        <w:t>refresh / freeze bar</w:t>
+      </w:r>
+    </w:p>
+    <w:p>
+      <w:pPr>
+        <w:numPr>
+          <w:ilvl w:val="1"/>
+          <w:numId w:val="17"/>
+        </w:numPr>
+      </w:pPr>
+      <w:r>
+        <w:t>delete signal</w:t>
+      </w:r>
+    </w:p>
+    <w:p>
+      <w:pPr>
+        <w:numPr>
+          <w:ilvl w:val="0"/>
+          <w:numId w:val="17"/>
+        </w:numPr>
+      </w:pPr>
+      <w:r>
+        <w:t>Còn CSignalBridgeWriter làm việc khác:</w:t>
+      </w:r>
+    </w:p>
+    <w:p>
+      <w:pPr>
+        <w:numPr>
+          <w:ilvl w:val="1"/>
+          <w:numId w:val="17"/>
+        </w:numPr>
+      </w:pPr>
+      <w:r>
+        <w:t>quét CIndicatorsCollection / CBarTimeSeriesCollection</w:t>
+      </w:r>
+    </w:p>
+    <w:p>
+      <w:pPr>
+        <w:numPr>
+          <w:ilvl w:val="1"/>
+          <w:numId w:val="17"/>
+        </w:numPr>
+      </w:pPr>
+      <w:r>
+        <w:t>lọc mẫu bằng ITemplateBuySellProvider</w:t>
+      </w:r>
+    </w:p>
+    <w:p>
+      <w:pPr>
+        <w:numPr>
+          <w:ilvl w:val="1"/>
+          <w:numId w:val="17"/>
+        </w:numPr>
+      </w:pPr>
+      <w:r>
+        <w:t>tạo danh sách row_time/row_tf/row_dir</w:t>
+      </w:r>
+    </w:p>
+    <w:p>
+      <w:pPr>
+        <w:numPr>
+          <w:ilvl w:val="1"/>
+          <w:numId w:val="17"/>
+        </w:numPr>
+      </w:pPr>
+      <w:r>
+        <w:t>ghi file bridge binary SignalBridge_*.dat</w:t>
+      </w:r>
+    </w:p>
+    <w:p>
+      <w:pPr>
+        <w:rPr>
+          <w:lang w:val="fr-FR"/>
+        </w:rPr>
+      </w:pPr>
+      <w:r>
+        <w:rPr>
+          <w:lang w:val="fr-FR"/>
+        </w:rPr>
+        <w:t>Đó là một service xuất dữ liệu, không phải là một collection.</w:t>
+      </w:r>
+    </w:p>
+    <w:p>
+      <w:pPr>
+        <w:rPr>
+          <w:b/>
+          <w:bCs/>
+        </w:rPr>
+      </w:pPr>
+      <w:r>
+        <w:rPr>
+          <w:b/>
+          <w:bCs/>
+        </w:rPr>
+        <w:t>Nếu merge sẽ gây ra</w:t>
+      </w:r>
+    </w:p>
+    <w:p>
+      <w:pPr>
+        <w:numPr>
+          <w:ilvl w:val="0"/>
+          <w:numId w:val="18"/>
+        </w:numPr>
+      </w:pPr>
+      <w:r>
+        <w:t>CSignalsCollection trở nên nặng nề, lẫn trách nhiệm:</w:t>
+      </w:r>
+    </w:p>
+    <w:p>
+      <w:pPr>
+        <w:numPr>
+          <w:ilvl w:val="1"/>
+          <w:numId w:val="18"/>
+        </w:numPr>
+      </w:pPr>
+      <w:r>
+        <w:t>vừa quản lý collection</w:t>
+      </w:r>
+    </w:p>
+    <w:p>
+      <w:pPr>
+        <w:numPr>
+          <w:ilvl w:val="1"/>
+          <w:numId w:val="18"/>
+        </w:numPr>
+      </w:pPr>
+      <w:r>
+        <w:t>vừa làm file export / bridge builder</w:t>
+      </w:r>
+    </w:p>
+    <w:p>
+      <w:pPr>
+        <w:numPr>
+          <w:ilvl w:val="0"/>
+          <w:numId w:val="18"/>
+        </w:numPr>
+      </w:pPr>
+      <w:r>
+        <w:t>làm khó tái sử dụng CSignalsCollection như thư viện chung</w:t>
+      </w:r>
+    </w:p>
+    <w:p>
+      <w:pPr>
+        <w:numPr>
+          <w:ilvl w:val="0"/>
+          <w:numId w:val="18"/>
+        </w:numPr>
+      </w:pPr>
+      <w:r>
+        <w:t>làm tăng coupling giữa logic file format và collection data</w:t>
+      </w:r>
+    </w:p>
+    <w:p>
+      <w:pPr>
+        <w:rPr>
+          <w:b/>
+          <w:bCs/>
+        </w:rPr>
+      </w:pPr>
+      <w:r>
+        <w:rPr>
+          <w:b/>
+          <w:bCs/>
+        </w:rPr>
+        <w:t>Cách tốt hơn</w:t>
+      </w:r>
+    </w:p>
+    <w:p>
+      <w:pPr>
+        <w:numPr>
+          <w:ilvl w:val="0"/>
+          <w:numId w:val="19"/>
+        </w:numPr>
+      </w:pPr>
+      <w:r>
+        <w:t>giữ CSignalBridgeWriter tách riêng</w:t>
+      </w:r>
+    </w:p>
+    <w:p>
+      <w:pPr>
+        <w:numPr>
+          <w:ilvl w:val="0"/>
+          <w:numId w:val="19"/>
+        </w:numPr>
+      </w:pPr>
+      <w:r>
+        <w:t>sửa nó sao cho dependency gọn hơn:</w:t>
+      </w:r>
+    </w:p>
+    <w:p>
+      <w:pPr>
+        <w:numPr>
+          <w:ilvl w:val="1"/>
+          <w:numId w:val="19"/>
+        </w:numPr>
+      </w:pPr>
+      <w:r>
+        <w:t>nhận trực tiếp CSignalsCollection * thay vì CTimeSeriesEngine *</w:t>
+      </w:r>
+    </w:p>
+    <w:p>
+      <w:pPr>
+        <w:numPr>
+          <w:ilvl w:val="1"/>
+          <w:numId w:val="19"/>
+        </w:numPr>
+      </w:pPr>
+      <w:r>
+        <w:t>vẫn giữ CIndicatorsCollection + CBarTimeSeriesCollection + ITemplateBuySellProvider</w:t>
+      </w:r>
+    </w:p>
+    <w:p>
+      <w:pPr>
+        <w:numPr>
+          <w:ilvl w:val="0"/>
+          <w:numId w:val="19"/>
+        </w:numPr>
+      </w:pPr>
+      <w:r>
+        <w:t>hoặc nếu cần, thêm helper nhỏ vào CSignalsCollection:</w:t>
+      </w:r>
+    </w:p>
+    <w:p>
+      <w:pPr>
+        <w:numPr>
+          <w:ilvl w:val="1"/>
+          <w:numId w:val="19"/>
+        </w:numPr>
+      </w:pPr>
+      <w:r>
+        <w:t>GetOrCreateSignal(...) vẫn đúng chỗ</w:t>
+      </w:r>
+    </w:p>
+    <w:p>
+      <w:pPr>
+        <w:numPr>
+          <w:ilvl w:val="1"/>
+          <w:numId w:val="19"/>
+        </w:numPr>
+      </w:pPr>
+      <w:r>
+        <w:lastRenderedPageBreak/>
+        <w:t>nhưng không thêm BuildAndWriteSignalBridge(...) hay WriteSignalBridgeFile(...)</w:t>
+      </w:r>
+    </w:p>
+    <w:p>
+      <w:pPr>
+        <w:rPr>
+          <w:b/>
+          <w:bCs/>
+        </w:rPr>
+      </w:pPr>
+      <w:r>
+        <w:rPr>
+          <w:b/>
+          <w:bCs/>
+        </w:rPr>
+        <w:t>Kết luận</w:t>
+      </w:r>
+    </w:p>
+    <w:p>
+      <w:pPr>
+        <w:numPr>
+          <w:ilvl w:val="0"/>
+          <w:numId w:val="20"/>
+        </w:numPr>
+      </w:pPr>
+      <w:r>
+        <w:t>CSignalsCollection = quản lý signal</w:t>
+      </w:r>
+    </w:p>
+    <w:p>
+      <w:pPr>
+        <w:numPr>
+          <w:ilvl w:val="0"/>
+          <w:numId w:val="20"/>
+        </w:numPr>
+      </w:pPr>
+      <w:r>
+        <w:t>CSignalBridgeWriter = xây bridge và xuất file</w:t>
       </w:r>
     </w:p>
     <w:p/>
@@ -270,6 +1570,155 @@
 <file path=word/numbering.xml><?xml version="1.0" encoding="utf-8"?>
 <w:numbering xmlns:wpc="http://schemas.microsoft.com/office/word/2010/wordprocessingCanvas" xmlns:cx="http://schemas.microsoft.com/office/drawing/2014/chartex" xmlns:cx1="http://schemas.microsoft.com/office/drawing/2015/9/8/chartex" xmlns:cx2="http://schemas.microsoft.com/office/drawing/2015/10/21/chartex" xmlns:cx3="http://schemas.microsoft.com/office/drawing/2016/5/9/chartex" xmlns:cx4="http://schemas.microsoft.com/office/drawing/2016/5/10/chartex" xmlns:cx5="http://schemas.microsoft.com/office/drawing/2016/5/11/chartex" xmlns:cx6="http://schemas.microsoft.com/office/drawing/2016/5/12/chartex" xmlns:cx7="http://schemas.microsoft.com/office/drawing/2016/5/13/chartex" xmlns:cx8="http://schemas.microsoft.com/office/drawing/2016/5/14/chartex" xmlns:mc="http://schemas.openxmlformats.org/markup-compatibility/2006" xmlns:aink="http://schemas.microsoft.com/office/drawing/2016/ink" xmlns:am3d="http://schemas.microsoft.com/office/drawing/2017/model3d" xmlns:o="urn:schemas-microsoft-com:office:office" xmlns:oel="http://schemas.microsoft.com/office/2019/extlst" xmlns:r="http://schemas.openxmlformats.org/officeDocument/2006/relationships" xmlns:m="http://schemas.openxmlformats.org/officeDocument/2006/math" xmlns:v="urn:schemas-microsoft-com:vml" xmlns:wp14="http://schemas.microsoft.com/office/word/2010/wordprocessingDrawing" xmlns:wp="http://schemas.openxmlformats.org/drawingml/2006/wordprocessingDrawing" xmlns:w10="urn:schemas-microsoft-com:office:word" xmlns:w="http://schemas.openxmlformats.org/wordprocessingml/2006/main" xmlns:w14="http://schemas.microsoft.com/office/word/2010/wordml" xmlns:w15="http://schemas.microsoft.com/office/word/2012/wordml" xmlns:w16cei="http://schemas.microsoft.com/office/word/2026/wordml/cei" xmlns:w16cex="http://schemas.microsoft.com/office/word/2018/wordml/cex" xmlns:w16cid="http://schemas.microsoft.com/office/word/2016/wordml/cid" xmlns:w16="http://schemas.microsoft.com/office/word/2018/wordml" xmlns:w16du="http://schemas.microsoft.com/office/word/2023/wordml/word16du" xmlns:w16sdtdh="http://schemas.microsoft.com/office/word/2020/wordml/sdtdatahash" xmlns:w16sdtfl="http://schemas.microsoft.com/office/word/2024/wordml/sdtformatlock" xmlns:w16se="http://schemas.microsoft.com/office/word/2015/wordml/symex" xmlns:wpg="http://schemas.microsoft.com/office/word/2010/wordprocessingGroup" xmlns:wpi="http://schemas.microsoft.com/office/word/2010/wordprocessingInk" xmlns:wne="http://schemas.microsoft.com/office/word/2006/wordml" xmlns:wps="http://schemas.microsoft.com/office/word/2010/wordprocessingShape" mc:Ignorable="w14 w15 w16se w16cid w16 w16cex w16sdtdh w16sdtfl w16du wp14">
   <w:abstractNum w:abstractNumId="0" w15:restartNumberingAfterBreak="0">
+    <w:nsid w:val="08E27027"/>
+    <w:multiLevelType w:val="multilevel"/>
+    <w:tmpl w:val="AD3EA5DC"/>
+    <w:lvl w:ilvl="0">
+      <w:start w:val="1"/>
+      <w:numFmt w:val="bullet"/>
+      <w:lvlText w:val=""/>
+      <w:lvlJc w:val="left"/>
+      <w:pPr>
+        <w:tabs>
+          <w:tab w:val="num" w:pos="720"/>
+        </w:tabs>
+        <w:ind w:left="720" w:hanging="360"/>
+      </w:pPr>
+      <w:rPr>
+        <w:rFonts w:ascii="Symbol" w:hAnsi="Symbol" w:hint="default"/>
+        <w:sz w:val="20"/>
+      </w:rPr>
+    </w:lvl>
+    <w:lvl w:ilvl="1">
+      <w:start w:val="1"/>
+      <w:numFmt w:val="bullet"/>
+      <w:lvlText w:val="o"/>
+      <w:lvlJc w:val="left"/>
+      <w:pPr>
+        <w:tabs>
+          <w:tab w:val="num" w:pos="1440"/>
+        </w:tabs>
+        <w:ind w:left="1440" w:hanging="360"/>
+      </w:pPr>
+      <w:rPr>
+        <w:rFonts w:ascii="Courier New" w:hAnsi="Courier New" w:hint="default"/>
+        <w:sz w:val="20"/>
+      </w:rPr>
+    </w:lvl>
+    <w:lvl w:ilvl="2" w:tentative="1">
+      <w:start w:val="1"/>
+      <w:numFmt w:val="bullet"/>
+      <w:lvlText w:val=""/>
+      <w:lvlJc w:val="left"/>
+      <w:pPr>
+        <w:tabs>
+          <w:tab w:val="num" w:pos="2160"/>
+        </w:tabs>
+        <w:ind w:left="2160" w:hanging="360"/>
+      </w:pPr>
+      <w:rPr>
+        <w:rFonts w:ascii="Wingdings" w:hAnsi="Wingdings" w:hint="default"/>
+        <w:sz w:val="20"/>
+      </w:rPr>
+    </w:lvl>
+    <w:lvl w:ilvl="3" w:tentative="1">
+      <w:start w:val="1"/>
+      <w:numFmt w:val="bullet"/>
+      <w:lvlText w:val=""/>
+      <w:lvlJc w:val="left"/>
+      <w:pPr>
+        <w:tabs>
+          <w:tab w:val="num" w:pos="2880"/>
+        </w:tabs>
+        <w:ind w:left="2880" w:hanging="360"/>
+      </w:pPr>
+      <w:rPr>
+        <w:rFonts w:ascii="Wingdings" w:hAnsi="Wingdings" w:hint="default"/>
+        <w:sz w:val="20"/>
+      </w:rPr>
+    </w:lvl>
+    <w:lvl w:ilvl="4" w:tentative="1">
+      <w:start w:val="1"/>
+      <w:numFmt w:val="bullet"/>
+      <w:lvlText w:val=""/>
+      <w:lvlJc w:val="left"/>
+      <w:pPr>
+        <w:tabs>
+          <w:tab w:val="num" w:pos="3600"/>
+        </w:tabs>
+        <w:ind w:left="3600" w:hanging="360"/>
+      </w:pPr>
+      <w:rPr>
+        <w:rFonts w:ascii="Wingdings" w:hAnsi="Wingdings" w:hint="default"/>
+        <w:sz w:val="20"/>
+      </w:rPr>
+    </w:lvl>
+    <w:lvl w:ilvl="5" w:tentative="1">
+      <w:start w:val="1"/>
+      <w:numFmt w:val="bullet"/>
+      <w:lvlText w:val=""/>
+      <w:lvlJc w:val="left"/>
+      <w:pPr>
+        <w:tabs>
+          <w:tab w:val="num" w:pos="4320"/>
+        </w:tabs>
+        <w:ind w:left="4320" w:hanging="360"/>
+      </w:pPr>
+      <w:rPr>
+        <w:rFonts w:ascii="Wingdings" w:hAnsi="Wingdings" w:hint="default"/>
+        <w:sz w:val="20"/>
+      </w:rPr>
+    </w:lvl>
+    <w:lvl w:ilvl="6" w:tentative="1">
+      <w:start w:val="1"/>
+      <w:numFmt w:val="bullet"/>
+      <w:lvlText w:val=""/>
+      <w:lvlJc w:val="left"/>
+      <w:pPr>
+        <w:tabs>
+          <w:tab w:val="num" w:pos="5040"/>
+        </w:tabs>
+        <w:ind w:left="5040" w:hanging="360"/>
+      </w:pPr>
+      <w:rPr>
+        <w:rFonts w:ascii="Wingdings" w:hAnsi="Wingdings" w:hint="default"/>
+        <w:sz w:val="20"/>
+      </w:rPr>
+    </w:lvl>
+    <w:lvl w:ilvl="7" w:tentative="1">
+      <w:start w:val="1"/>
+      <w:numFmt w:val="bullet"/>
+      <w:lvlText w:val=""/>
+      <w:lvlJc w:val="left"/>
+      <w:pPr>
+        <w:tabs>
+          <w:tab w:val="num" w:pos="5760"/>
+        </w:tabs>
+        <w:ind w:left="5760" w:hanging="360"/>
+      </w:pPr>
+      <w:rPr>
+        <w:rFonts w:ascii="Wingdings" w:hAnsi="Wingdings" w:hint="default"/>
+        <w:sz w:val="20"/>
+      </w:rPr>
+    </w:lvl>
+    <w:lvl w:ilvl="8" w:tentative="1">
+      <w:start w:val="1"/>
+      <w:numFmt w:val="bullet"/>
+      <w:lvlText w:val=""/>
+      <w:lvlJc w:val="left"/>
+      <w:pPr>
+        <w:tabs>
+          <w:tab w:val="num" w:pos="6480"/>
+        </w:tabs>
+        <w:ind w:left="6480" w:hanging="360"/>
+      </w:pPr>
+      <w:rPr>
+        <w:rFonts w:ascii="Wingdings" w:hAnsi="Wingdings" w:hint="default"/>
+        <w:sz w:val="20"/>
+      </w:rPr>
+    </w:lvl>
+  </w:abstractNum>
+  <w:abstractNum w:abstractNumId="1" w15:restartNumberingAfterBreak="0">
     <w:nsid w:val="09AF3C34"/>
     <w:multiLevelType w:val="multilevel"/>
     <w:tmpl w:val="BAB4067A"/>
@@ -418,7 +1867,305 @@
       </w:rPr>
     </w:lvl>
   </w:abstractNum>
-  <w:abstractNum w:abstractNumId="1" w15:restartNumberingAfterBreak="0">
+  <w:abstractNum w:abstractNumId="2" w15:restartNumberingAfterBreak="0">
+    <w:nsid w:val="0A0C3142"/>
+    <w:multiLevelType w:val="multilevel"/>
+    <w:tmpl w:val="DAD82518"/>
+    <w:lvl w:ilvl="0">
+      <w:start w:val="1"/>
+      <w:numFmt w:val="bullet"/>
+      <w:lvlText w:val=""/>
+      <w:lvlJc w:val="left"/>
+      <w:pPr>
+        <w:tabs>
+          <w:tab w:val="num" w:pos="720"/>
+        </w:tabs>
+        <w:ind w:left="720" w:hanging="360"/>
+      </w:pPr>
+      <w:rPr>
+        <w:rFonts w:ascii="Symbol" w:hAnsi="Symbol" w:hint="default"/>
+        <w:sz w:val="20"/>
+      </w:rPr>
+    </w:lvl>
+    <w:lvl w:ilvl="1" w:tentative="1">
+      <w:start w:val="1"/>
+      <w:numFmt w:val="bullet"/>
+      <w:lvlText w:val="o"/>
+      <w:lvlJc w:val="left"/>
+      <w:pPr>
+        <w:tabs>
+          <w:tab w:val="num" w:pos="1440"/>
+        </w:tabs>
+        <w:ind w:left="1440" w:hanging="360"/>
+      </w:pPr>
+      <w:rPr>
+        <w:rFonts w:ascii="Courier New" w:hAnsi="Courier New" w:hint="default"/>
+        <w:sz w:val="20"/>
+      </w:rPr>
+    </w:lvl>
+    <w:lvl w:ilvl="2" w:tentative="1">
+      <w:start w:val="1"/>
+      <w:numFmt w:val="bullet"/>
+      <w:lvlText w:val=""/>
+      <w:lvlJc w:val="left"/>
+      <w:pPr>
+        <w:tabs>
+          <w:tab w:val="num" w:pos="2160"/>
+        </w:tabs>
+        <w:ind w:left="2160" w:hanging="360"/>
+      </w:pPr>
+      <w:rPr>
+        <w:rFonts w:ascii="Wingdings" w:hAnsi="Wingdings" w:hint="default"/>
+        <w:sz w:val="20"/>
+      </w:rPr>
+    </w:lvl>
+    <w:lvl w:ilvl="3" w:tentative="1">
+      <w:start w:val="1"/>
+      <w:numFmt w:val="bullet"/>
+      <w:lvlText w:val=""/>
+      <w:lvlJc w:val="left"/>
+      <w:pPr>
+        <w:tabs>
+          <w:tab w:val="num" w:pos="2880"/>
+        </w:tabs>
+        <w:ind w:left="2880" w:hanging="360"/>
+      </w:pPr>
+      <w:rPr>
+        <w:rFonts w:ascii="Wingdings" w:hAnsi="Wingdings" w:hint="default"/>
+        <w:sz w:val="20"/>
+      </w:rPr>
+    </w:lvl>
+    <w:lvl w:ilvl="4" w:tentative="1">
+      <w:start w:val="1"/>
+      <w:numFmt w:val="bullet"/>
+      <w:lvlText w:val=""/>
+      <w:lvlJc w:val="left"/>
+      <w:pPr>
+        <w:tabs>
+          <w:tab w:val="num" w:pos="3600"/>
+        </w:tabs>
+        <w:ind w:left="3600" w:hanging="360"/>
+      </w:pPr>
+      <w:rPr>
+        <w:rFonts w:ascii="Wingdings" w:hAnsi="Wingdings" w:hint="default"/>
+        <w:sz w:val="20"/>
+      </w:rPr>
+    </w:lvl>
+    <w:lvl w:ilvl="5" w:tentative="1">
+      <w:start w:val="1"/>
+      <w:numFmt w:val="bullet"/>
+      <w:lvlText w:val=""/>
+      <w:lvlJc w:val="left"/>
+      <w:pPr>
+        <w:tabs>
+          <w:tab w:val="num" w:pos="4320"/>
+        </w:tabs>
+        <w:ind w:left="4320" w:hanging="360"/>
+      </w:pPr>
+      <w:rPr>
+        <w:rFonts w:ascii="Wingdings" w:hAnsi="Wingdings" w:hint="default"/>
+        <w:sz w:val="20"/>
+      </w:rPr>
+    </w:lvl>
+    <w:lvl w:ilvl="6" w:tentative="1">
+      <w:start w:val="1"/>
+      <w:numFmt w:val="bullet"/>
+      <w:lvlText w:val=""/>
+      <w:lvlJc w:val="left"/>
+      <w:pPr>
+        <w:tabs>
+          <w:tab w:val="num" w:pos="5040"/>
+        </w:tabs>
+        <w:ind w:left="5040" w:hanging="360"/>
+      </w:pPr>
+      <w:rPr>
+        <w:rFonts w:ascii="Wingdings" w:hAnsi="Wingdings" w:hint="default"/>
+        <w:sz w:val="20"/>
+      </w:rPr>
+    </w:lvl>
+    <w:lvl w:ilvl="7" w:tentative="1">
+      <w:start w:val="1"/>
+      <w:numFmt w:val="bullet"/>
+      <w:lvlText w:val=""/>
+      <w:lvlJc w:val="left"/>
+      <w:pPr>
+        <w:tabs>
+          <w:tab w:val="num" w:pos="5760"/>
+        </w:tabs>
+        <w:ind w:left="5760" w:hanging="360"/>
+      </w:pPr>
+      <w:rPr>
+        <w:rFonts w:ascii="Wingdings" w:hAnsi="Wingdings" w:hint="default"/>
+        <w:sz w:val="20"/>
+      </w:rPr>
+    </w:lvl>
+    <w:lvl w:ilvl="8" w:tentative="1">
+      <w:start w:val="1"/>
+      <w:numFmt w:val="bullet"/>
+      <w:lvlText w:val=""/>
+      <w:lvlJc w:val="left"/>
+      <w:pPr>
+        <w:tabs>
+          <w:tab w:val="num" w:pos="6480"/>
+        </w:tabs>
+        <w:ind w:left="6480" w:hanging="360"/>
+      </w:pPr>
+      <w:rPr>
+        <w:rFonts w:ascii="Wingdings" w:hAnsi="Wingdings" w:hint="default"/>
+        <w:sz w:val="20"/>
+      </w:rPr>
+    </w:lvl>
+  </w:abstractNum>
+  <w:abstractNum w:abstractNumId="3" w15:restartNumberingAfterBreak="0">
+    <w:nsid w:val="10B409CC"/>
+    <w:multiLevelType w:val="multilevel"/>
+    <w:tmpl w:val="2B723C92"/>
+    <w:lvl w:ilvl="0">
+      <w:start w:val="1"/>
+      <w:numFmt w:val="bullet"/>
+      <w:lvlText w:val=""/>
+      <w:lvlJc w:val="left"/>
+      <w:pPr>
+        <w:tabs>
+          <w:tab w:val="num" w:pos="720"/>
+        </w:tabs>
+        <w:ind w:left="720" w:hanging="360"/>
+      </w:pPr>
+      <w:rPr>
+        <w:rFonts w:ascii="Symbol" w:hAnsi="Symbol" w:hint="default"/>
+        <w:sz w:val="20"/>
+      </w:rPr>
+    </w:lvl>
+    <w:lvl w:ilvl="1" w:tentative="1">
+      <w:start w:val="1"/>
+      <w:numFmt w:val="bullet"/>
+      <w:lvlText w:val="o"/>
+      <w:lvlJc w:val="left"/>
+      <w:pPr>
+        <w:tabs>
+          <w:tab w:val="num" w:pos="1440"/>
+        </w:tabs>
+        <w:ind w:left="1440" w:hanging="360"/>
+      </w:pPr>
+      <w:rPr>
+        <w:rFonts w:ascii="Courier New" w:hAnsi="Courier New" w:hint="default"/>
+        <w:sz w:val="20"/>
+      </w:rPr>
+    </w:lvl>
+    <w:lvl w:ilvl="2" w:tentative="1">
+      <w:start w:val="1"/>
+      <w:numFmt w:val="bullet"/>
+      <w:lvlText w:val=""/>
+      <w:lvlJc w:val="left"/>
+      <w:pPr>
+        <w:tabs>
+          <w:tab w:val="num" w:pos="2160"/>
+        </w:tabs>
+        <w:ind w:left="2160" w:hanging="360"/>
+      </w:pPr>
+      <w:rPr>
+        <w:rFonts w:ascii="Wingdings" w:hAnsi="Wingdings" w:hint="default"/>
+        <w:sz w:val="20"/>
+      </w:rPr>
+    </w:lvl>
+    <w:lvl w:ilvl="3" w:tentative="1">
+      <w:start w:val="1"/>
+      <w:numFmt w:val="bullet"/>
+      <w:lvlText w:val=""/>
+      <w:lvlJc w:val="left"/>
+      <w:pPr>
+        <w:tabs>
+          <w:tab w:val="num" w:pos="2880"/>
+        </w:tabs>
+        <w:ind w:left="2880" w:hanging="360"/>
+      </w:pPr>
+      <w:rPr>
+        <w:rFonts w:ascii="Wingdings" w:hAnsi="Wingdings" w:hint="default"/>
+        <w:sz w:val="20"/>
+      </w:rPr>
+    </w:lvl>
+    <w:lvl w:ilvl="4" w:tentative="1">
+      <w:start w:val="1"/>
+      <w:numFmt w:val="bullet"/>
+      <w:lvlText w:val=""/>
+      <w:lvlJc w:val="left"/>
+      <w:pPr>
+        <w:tabs>
+          <w:tab w:val="num" w:pos="3600"/>
+        </w:tabs>
+        <w:ind w:left="3600" w:hanging="360"/>
+      </w:pPr>
+      <w:rPr>
+        <w:rFonts w:ascii="Wingdings" w:hAnsi="Wingdings" w:hint="default"/>
+        <w:sz w:val="20"/>
+      </w:rPr>
+    </w:lvl>
+    <w:lvl w:ilvl="5" w:tentative="1">
+      <w:start w:val="1"/>
+      <w:numFmt w:val="bullet"/>
+      <w:lvlText w:val=""/>
+      <w:lvlJc w:val="left"/>
+      <w:pPr>
+        <w:tabs>
+          <w:tab w:val="num" w:pos="4320"/>
+        </w:tabs>
+        <w:ind w:left="4320" w:hanging="360"/>
+      </w:pPr>
+      <w:rPr>
+        <w:rFonts w:ascii="Wingdings" w:hAnsi="Wingdings" w:hint="default"/>
+        <w:sz w:val="20"/>
+      </w:rPr>
+    </w:lvl>
+    <w:lvl w:ilvl="6" w:tentative="1">
+      <w:start w:val="1"/>
+      <w:numFmt w:val="bullet"/>
+      <w:lvlText w:val=""/>
+      <w:lvlJc w:val="left"/>
+      <w:pPr>
+        <w:tabs>
+          <w:tab w:val="num" w:pos="5040"/>
+        </w:tabs>
+        <w:ind w:left="5040" w:hanging="360"/>
+      </w:pPr>
+      <w:rPr>
+        <w:rFonts w:ascii="Wingdings" w:hAnsi="Wingdings" w:hint="default"/>
+        <w:sz w:val="20"/>
+      </w:rPr>
+    </w:lvl>
+    <w:lvl w:ilvl="7" w:tentative="1">
+      <w:start w:val="1"/>
+      <w:numFmt w:val="bullet"/>
+      <w:lvlText w:val=""/>
+      <w:lvlJc w:val="left"/>
+      <w:pPr>
+        <w:tabs>
+          <w:tab w:val="num" w:pos="5760"/>
+        </w:tabs>
+        <w:ind w:left="5760" w:hanging="360"/>
+      </w:pPr>
+      <w:rPr>
+        <w:rFonts w:ascii="Wingdings" w:hAnsi="Wingdings" w:hint="default"/>
+        <w:sz w:val="20"/>
+      </w:rPr>
+    </w:lvl>
+    <w:lvl w:ilvl="8" w:tentative="1">
+      <w:start w:val="1"/>
+      <w:numFmt w:val="bullet"/>
+      <w:lvlText w:val=""/>
+      <w:lvlJc w:val="left"/>
+      <w:pPr>
+        <w:tabs>
+          <w:tab w:val="num" w:pos="6480"/>
+        </w:tabs>
+        <w:ind w:left="6480" w:hanging="360"/>
+      </w:pPr>
+      <w:rPr>
+        <w:rFonts w:ascii="Wingdings" w:hAnsi="Wingdings" w:hint="default"/>
+        <w:sz w:val="20"/>
+      </w:rPr>
+    </w:lvl>
+  </w:abstractNum>
+  <w:abstractNum w:abstractNumId="4" w15:restartNumberingAfterBreak="0">
     <w:nsid w:val="24365EF0"/>
     <w:multiLevelType w:val="multilevel"/>
     <w:tmpl w:val="C570ED32"/>
@@ -531,7 +2278,454 @@
       </w:pPr>
     </w:lvl>
   </w:abstractNum>
-  <w:abstractNum w:abstractNumId="2" w15:restartNumberingAfterBreak="0">
+  <w:abstractNum w:abstractNumId="5" w15:restartNumberingAfterBreak="0">
+    <w:nsid w:val="25BA1288"/>
+    <w:multiLevelType w:val="multilevel"/>
+    <w:tmpl w:val="3F12EFB4"/>
+    <w:lvl w:ilvl="0">
+      <w:start w:val="1"/>
+      <w:numFmt w:val="bullet"/>
+      <w:lvlText w:val=""/>
+      <w:lvlJc w:val="left"/>
+      <w:pPr>
+        <w:tabs>
+          <w:tab w:val="num" w:pos="720"/>
+        </w:tabs>
+        <w:ind w:left="720" w:hanging="360"/>
+      </w:pPr>
+      <w:rPr>
+        <w:rFonts w:ascii="Symbol" w:hAnsi="Symbol" w:hint="default"/>
+        <w:sz w:val="20"/>
+      </w:rPr>
+    </w:lvl>
+    <w:lvl w:ilvl="1" w:tentative="1">
+      <w:start w:val="1"/>
+      <w:numFmt w:val="bullet"/>
+      <w:lvlText w:val="o"/>
+      <w:lvlJc w:val="left"/>
+      <w:pPr>
+        <w:tabs>
+          <w:tab w:val="num" w:pos="1440"/>
+        </w:tabs>
+        <w:ind w:left="1440" w:hanging="360"/>
+      </w:pPr>
+      <w:rPr>
+        <w:rFonts w:ascii="Courier New" w:hAnsi="Courier New" w:hint="default"/>
+        <w:sz w:val="20"/>
+      </w:rPr>
+    </w:lvl>
+    <w:lvl w:ilvl="2" w:tentative="1">
+      <w:start w:val="1"/>
+      <w:numFmt w:val="bullet"/>
+      <w:lvlText w:val=""/>
+      <w:lvlJc w:val="left"/>
+      <w:pPr>
+        <w:tabs>
+          <w:tab w:val="num" w:pos="2160"/>
+        </w:tabs>
+        <w:ind w:left="2160" w:hanging="360"/>
+      </w:pPr>
+      <w:rPr>
+        <w:rFonts w:ascii="Wingdings" w:hAnsi="Wingdings" w:hint="default"/>
+        <w:sz w:val="20"/>
+      </w:rPr>
+    </w:lvl>
+    <w:lvl w:ilvl="3" w:tentative="1">
+      <w:start w:val="1"/>
+      <w:numFmt w:val="bullet"/>
+      <w:lvlText w:val=""/>
+      <w:lvlJc w:val="left"/>
+      <w:pPr>
+        <w:tabs>
+          <w:tab w:val="num" w:pos="2880"/>
+        </w:tabs>
+        <w:ind w:left="2880" w:hanging="360"/>
+      </w:pPr>
+      <w:rPr>
+        <w:rFonts w:ascii="Wingdings" w:hAnsi="Wingdings" w:hint="default"/>
+        <w:sz w:val="20"/>
+      </w:rPr>
+    </w:lvl>
+    <w:lvl w:ilvl="4" w:tentative="1">
+      <w:start w:val="1"/>
+      <w:numFmt w:val="bullet"/>
+      <w:lvlText w:val=""/>
+      <w:lvlJc w:val="left"/>
+      <w:pPr>
+        <w:tabs>
+          <w:tab w:val="num" w:pos="3600"/>
+        </w:tabs>
+        <w:ind w:left="3600" w:hanging="360"/>
+      </w:pPr>
+      <w:rPr>
+        <w:rFonts w:ascii="Wingdings" w:hAnsi="Wingdings" w:hint="default"/>
+        <w:sz w:val="20"/>
+      </w:rPr>
+    </w:lvl>
+    <w:lvl w:ilvl="5" w:tentative="1">
+      <w:start w:val="1"/>
+      <w:numFmt w:val="bullet"/>
+      <w:lvlText w:val=""/>
+      <w:lvlJc w:val="left"/>
+      <w:pPr>
+        <w:tabs>
+          <w:tab w:val="num" w:pos="4320"/>
+        </w:tabs>
+        <w:ind w:left="4320" w:hanging="360"/>
+      </w:pPr>
+      <w:rPr>
+        <w:rFonts w:ascii="Wingdings" w:hAnsi="Wingdings" w:hint="default"/>
+        <w:sz w:val="20"/>
+      </w:rPr>
+    </w:lvl>
+    <w:lvl w:ilvl="6" w:tentative="1">
+      <w:start w:val="1"/>
+      <w:numFmt w:val="bullet"/>
+      <w:lvlText w:val=""/>
+      <w:lvlJc w:val="left"/>
+      <w:pPr>
+        <w:tabs>
+          <w:tab w:val="num" w:pos="5040"/>
+        </w:tabs>
+        <w:ind w:left="5040" w:hanging="360"/>
+      </w:pPr>
+      <w:rPr>
+        <w:rFonts w:ascii="Wingdings" w:hAnsi="Wingdings" w:hint="default"/>
+        <w:sz w:val="20"/>
+      </w:rPr>
+    </w:lvl>
+    <w:lvl w:ilvl="7" w:tentative="1">
+      <w:start w:val="1"/>
+      <w:numFmt w:val="bullet"/>
+      <w:lvlText w:val=""/>
+      <w:lvlJc w:val="left"/>
+      <w:pPr>
+        <w:tabs>
+          <w:tab w:val="num" w:pos="5760"/>
+        </w:tabs>
+        <w:ind w:left="5760" w:hanging="360"/>
+      </w:pPr>
+      <w:rPr>
+        <w:rFonts w:ascii="Wingdings" w:hAnsi="Wingdings" w:hint="default"/>
+        <w:sz w:val="20"/>
+      </w:rPr>
+    </w:lvl>
+    <w:lvl w:ilvl="8" w:tentative="1">
+      <w:start w:val="1"/>
+      <w:numFmt w:val="bullet"/>
+      <w:lvlText w:val=""/>
+      <w:lvlJc w:val="left"/>
+      <w:pPr>
+        <w:tabs>
+          <w:tab w:val="num" w:pos="6480"/>
+        </w:tabs>
+        <w:ind w:left="6480" w:hanging="360"/>
+      </w:pPr>
+      <w:rPr>
+        <w:rFonts w:ascii="Wingdings" w:hAnsi="Wingdings" w:hint="default"/>
+        <w:sz w:val="20"/>
+      </w:rPr>
+    </w:lvl>
+  </w:abstractNum>
+  <w:abstractNum w:abstractNumId="6" w15:restartNumberingAfterBreak="0">
+    <w:nsid w:val="35BC1AEC"/>
+    <w:multiLevelType w:val="multilevel"/>
+    <w:tmpl w:val="29B0BD3A"/>
+    <w:lvl w:ilvl="0">
+      <w:start w:val="1"/>
+      <w:numFmt w:val="bullet"/>
+      <w:lvlText w:val=""/>
+      <w:lvlJc w:val="left"/>
+      <w:pPr>
+        <w:tabs>
+          <w:tab w:val="num" w:pos="720"/>
+        </w:tabs>
+        <w:ind w:left="720" w:hanging="360"/>
+      </w:pPr>
+      <w:rPr>
+        <w:rFonts w:ascii="Symbol" w:hAnsi="Symbol" w:hint="default"/>
+        <w:sz w:val="20"/>
+      </w:rPr>
+    </w:lvl>
+    <w:lvl w:ilvl="1">
+      <w:start w:val="1"/>
+      <w:numFmt w:val="bullet"/>
+      <w:lvlText w:val="o"/>
+      <w:lvlJc w:val="left"/>
+      <w:pPr>
+        <w:tabs>
+          <w:tab w:val="num" w:pos="1440"/>
+        </w:tabs>
+        <w:ind w:left="1440" w:hanging="360"/>
+      </w:pPr>
+      <w:rPr>
+        <w:rFonts w:ascii="Courier New" w:hAnsi="Courier New" w:hint="default"/>
+        <w:sz w:val="20"/>
+      </w:rPr>
+    </w:lvl>
+    <w:lvl w:ilvl="2" w:tentative="1">
+      <w:start w:val="1"/>
+      <w:numFmt w:val="bullet"/>
+      <w:lvlText w:val=""/>
+      <w:lvlJc w:val="left"/>
+      <w:pPr>
+        <w:tabs>
+          <w:tab w:val="num" w:pos="2160"/>
+        </w:tabs>
+        <w:ind w:left="2160" w:hanging="360"/>
+      </w:pPr>
+      <w:rPr>
+        <w:rFonts w:ascii="Wingdings" w:hAnsi="Wingdings" w:hint="default"/>
+        <w:sz w:val="20"/>
+      </w:rPr>
+    </w:lvl>
+    <w:lvl w:ilvl="3" w:tentative="1">
+      <w:start w:val="1"/>
+      <w:numFmt w:val="bullet"/>
+      <w:lvlText w:val=""/>
+      <w:lvlJc w:val="left"/>
+      <w:pPr>
+        <w:tabs>
+          <w:tab w:val="num" w:pos="2880"/>
+        </w:tabs>
+        <w:ind w:left="2880" w:hanging="360"/>
+      </w:pPr>
+      <w:rPr>
+        <w:rFonts w:ascii="Wingdings" w:hAnsi="Wingdings" w:hint="default"/>
+        <w:sz w:val="20"/>
+      </w:rPr>
+    </w:lvl>
+    <w:lvl w:ilvl="4" w:tentative="1">
+      <w:start w:val="1"/>
+      <w:numFmt w:val="bullet"/>
+      <w:lvlText w:val=""/>
+      <w:lvlJc w:val="left"/>
+      <w:pPr>
+        <w:tabs>
+          <w:tab w:val="num" w:pos="3600"/>
+        </w:tabs>
+        <w:ind w:left="3600" w:hanging="360"/>
+      </w:pPr>
+      <w:rPr>
+        <w:rFonts w:ascii="Wingdings" w:hAnsi="Wingdings" w:hint="default"/>
+        <w:sz w:val="20"/>
+      </w:rPr>
+    </w:lvl>
+    <w:lvl w:ilvl="5" w:tentative="1">
+      <w:start w:val="1"/>
+      <w:numFmt w:val="bullet"/>
+      <w:lvlText w:val=""/>
+      <w:lvlJc w:val="left"/>
+      <w:pPr>
+        <w:tabs>
+          <w:tab w:val="num" w:pos="4320"/>
+        </w:tabs>
+        <w:ind w:left="4320" w:hanging="360"/>
+      </w:pPr>
+      <w:rPr>
+        <w:rFonts w:ascii="Wingdings" w:hAnsi="Wingdings" w:hint="default"/>
+        <w:sz w:val="20"/>
+      </w:rPr>
+    </w:lvl>
+    <w:lvl w:ilvl="6" w:tentative="1">
+      <w:start w:val="1"/>
+      <w:numFmt w:val="bullet"/>
+      <w:lvlText w:val=""/>
+      <w:lvlJc w:val="left"/>
+      <w:pPr>
+        <w:tabs>
+          <w:tab w:val="num" w:pos="5040"/>
+        </w:tabs>
+        <w:ind w:left="5040" w:hanging="360"/>
+      </w:pPr>
+      <w:rPr>
+        <w:rFonts w:ascii="Wingdings" w:hAnsi="Wingdings" w:hint="default"/>
+        <w:sz w:val="20"/>
+      </w:rPr>
+    </w:lvl>
+    <w:lvl w:ilvl="7" w:tentative="1">
+      <w:start w:val="1"/>
+      <w:numFmt w:val="bullet"/>
+      <w:lvlText w:val=""/>
+      <w:lvlJc w:val="left"/>
+      <w:pPr>
+        <w:tabs>
+          <w:tab w:val="num" w:pos="5760"/>
+        </w:tabs>
+        <w:ind w:left="5760" w:hanging="360"/>
+      </w:pPr>
+      <w:rPr>
+        <w:rFonts w:ascii="Wingdings" w:hAnsi="Wingdings" w:hint="default"/>
+        <w:sz w:val="20"/>
+      </w:rPr>
+    </w:lvl>
+    <w:lvl w:ilvl="8" w:tentative="1">
+      <w:start w:val="1"/>
+      <w:numFmt w:val="bullet"/>
+      <w:lvlText w:val=""/>
+      <w:lvlJc w:val="left"/>
+      <w:pPr>
+        <w:tabs>
+          <w:tab w:val="num" w:pos="6480"/>
+        </w:tabs>
+        <w:ind w:left="6480" w:hanging="360"/>
+      </w:pPr>
+      <w:rPr>
+        <w:rFonts w:ascii="Wingdings" w:hAnsi="Wingdings" w:hint="default"/>
+        <w:sz w:val="20"/>
+      </w:rPr>
+    </w:lvl>
+  </w:abstractNum>
+  <w:abstractNum w:abstractNumId="7" w15:restartNumberingAfterBreak="0">
+    <w:nsid w:val="3B771356"/>
+    <w:multiLevelType w:val="multilevel"/>
+    <w:tmpl w:val="224AB296"/>
+    <w:lvl w:ilvl="0">
+      <w:start w:val="1"/>
+      <w:numFmt w:val="bullet"/>
+      <w:lvlText w:val=""/>
+      <w:lvlJc w:val="left"/>
+      <w:pPr>
+        <w:tabs>
+          <w:tab w:val="num" w:pos="720"/>
+        </w:tabs>
+        <w:ind w:left="720" w:hanging="360"/>
+      </w:pPr>
+      <w:rPr>
+        <w:rFonts w:ascii="Symbol" w:hAnsi="Symbol" w:hint="default"/>
+        <w:sz w:val="20"/>
+      </w:rPr>
+    </w:lvl>
+    <w:lvl w:ilvl="1">
+      <w:start w:val="1"/>
+      <w:numFmt w:val="bullet"/>
+      <w:lvlText w:val="o"/>
+      <w:lvlJc w:val="left"/>
+      <w:pPr>
+        <w:tabs>
+          <w:tab w:val="num" w:pos="1440"/>
+        </w:tabs>
+        <w:ind w:left="1440" w:hanging="360"/>
+      </w:pPr>
+      <w:rPr>
+        <w:rFonts w:ascii="Courier New" w:hAnsi="Courier New" w:hint="default"/>
+        <w:sz w:val="20"/>
+      </w:rPr>
+    </w:lvl>
+    <w:lvl w:ilvl="2">
+      <w:start w:val="1"/>
+      <w:numFmt w:val="bullet"/>
+      <w:lvlText w:val=""/>
+      <w:lvlJc w:val="left"/>
+      <w:pPr>
+        <w:tabs>
+          <w:tab w:val="num" w:pos="2160"/>
+        </w:tabs>
+        <w:ind w:left="2160" w:hanging="360"/>
+      </w:pPr>
+      <w:rPr>
+        <w:rFonts w:ascii="Wingdings" w:hAnsi="Wingdings" w:hint="default"/>
+        <w:sz w:val="20"/>
+      </w:rPr>
+    </w:lvl>
+    <w:lvl w:ilvl="3" w:tentative="1">
+      <w:start w:val="1"/>
+      <w:numFmt w:val="bullet"/>
+      <w:lvlText w:val=""/>
+      <w:lvlJc w:val="left"/>
+      <w:pPr>
+        <w:tabs>
+          <w:tab w:val="num" w:pos="2880"/>
+        </w:tabs>
+        <w:ind w:left="2880" w:hanging="360"/>
+      </w:pPr>
+      <w:rPr>
+        <w:rFonts w:ascii="Wingdings" w:hAnsi="Wingdings" w:hint="default"/>
+        <w:sz w:val="20"/>
+      </w:rPr>
+    </w:lvl>
+    <w:lvl w:ilvl="4" w:tentative="1">
+      <w:start w:val="1"/>
+      <w:numFmt w:val="bullet"/>
+      <w:lvlText w:val=""/>
+      <w:lvlJc w:val="left"/>
+      <w:pPr>
+        <w:tabs>
+          <w:tab w:val="num" w:pos="3600"/>
+        </w:tabs>
+        <w:ind w:left="3600" w:hanging="360"/>
+      </w:pPr>
+      <w:rPr>
+        <w:rFonts w:ascii="Wingdings" w:hAnsi="Wingdings" w:hint="default"/>
+        <w:sz w:val="20"/>
+      </w:rPr>
+    </w:lvl>
+    <w:lvl w:ilvl="5" w:tentative="1">
+      <w:start w:val="1"/>
+      <w:numFmt w:val="bullet"/>
+      <w:lvlText w:val=""/>
+      <w:lvlJc w:val="left"/>
+      <w:pPr>
+        <w:tabs>
+          <w:tab w:val="num" w:pos="4320"/>
+        </w:tabs>
+        <w:ind w:left="4320" w:hanging="360"/>
+      </w:pPr>
+      <w:rPr>
+        <w:rFonts w:ascii="Wingdings" w:hAnsi="Wingdings" w:hint="default"/>
+        <w:sz w:val="20"/>
+      </w:rPr>
+    </w:lvl>
+    <w:lvl w:ilvl="6" w:tentative="1">
+      <w:start w:val="1"/>
+      <w:numFmt w:val="bullet"/>
+      <w:lvlText w:val=""/>
+      <w:lvlJc w:val="left"/>
+      <w:pPr>
+        <w:tabs>
+          <w:tab w:val="num" w:pos="5040"/>
+        </w:tabs>
+        <w:ind w:left="5040" w:hanging="360"/>
+      </w:pPr>
+      <w:rPr>
+        <w:rFonts w:ascii="Wingdings" w:hAnsi="Wingdings" w:hint="default"/>
+        <w:sz w:val="20"/>
+      </w:rPr>
+    </w:lvl>
+    <w:lvl w:ilvl="7" w:tentative="1">
+      <w:start w:val="1"/>
+      <w:numFmt w:val="bullet"/>
+      <w:lvlText w:val=""/>
+      <w:lvlJc w:val="left"/>
+      <w:pPr>
+        <w:tabs>
+          <w:tab w:val="num" w:pos="5760"/>
+        </w:tabs>
+        <w:ind w:left="5760" w:hanging="360"/>
+      </w:pPr>
+      <w:rPr>
+        <w:rFonts w:ascii="Wingdings" w:hAnsi="Wingdings" w:hint="default"/>
+        <w:sz w:val="20"/>
+      </w:rPr>
+    </w:lvl>
+    <w:lvl w:ilvl="8" w:tentative="1">
+      <w:start w:val="1"/>
+      <w:numFmt w:val="bullet"/>
+      <w:lvlText w:val=""/>
+      <w:lvlJc w:val="left"/>
+      <w:pPr>
+        <w:tabs>
+          <w:tab w:val="num" w:pos="6480"/>
+        </w:tabs>
+        <w:ind w:left="6480" w:hanging="360"/>
+      </w:pPr>
+      <w:rPr>
+        <w:rFonts w:ascii="Wingdings" w:hAnsi="Wingdings" w:hint="default"/>
+        <w:sz w:val="20"/>
+      </w:rPr>
+    </w:lvl>
+  </w:abstractNum>
+  <w:abstractNum w:abstractNumId="8" w15:restartNumberingAfterBreak="0">
     <w:nsid w:val="410B7FFC"/>
     <w:multiLevelType w:val="multilevel"/>
     <w:tmpl w:val="7E341580"/>
@@ -680,7 +2874,1437 @@
       </w:rPr>
     </w:lvl>
   </w:abstractNum>
-  <w:abstractNum w:abstractNumId="3" w15:restartNumberingAfterBreak="0">
+  <w:abstractNum w:abstractNumId="9" w15:restartNumberingAfterBreak="0">
+    <w:nsid w:val="44AC2A8C"/>
+    <w:multiLevelType w:val="multilevel"/>
+    <w:tmpl w:val="E8968522"/>
+    <w:lvl w:ilvl="0">
+      <w:start w:val="1"/>
+      <w:numFmt w:val="bullet"/>
+      <w:lvlText w:val=""/>
+      <w:lvlJc w:val="left"/>
+      <w:pPr>
+        <w:tabs>
+          <w:tab w:val="num" w:pos="720"/>
+        </w:tabs>
+        <w:ind w:left="720" w:hanging="360"/>
+      </w:pPr>
+      <w:rPr>
+        <w:rFonts w:ascii="Symbol" w:hAnsi="Symbol" w:hint="default"/>
+        <w:sz w:val="20"/>
+      </w:rPr>
+    </w:lvl>
+    <w:lvl w:ilvl="1" w:tentative="1">
+      <w:start w:val="1"/>
+      <w:numFmt w:val="bullet"/>
+      <w:lvlText w:val="o"/>
+      <w:lvlJc w:val="left"/>
+      <w:pPr>
+        <w:tabs>
+          <w:tab w:val="num" w:pos="1440"/>
+        </w:tabs>
+        <w:ind w:left="1440" w:hanging="360"/>
+      </w:pPr>
+      <w:rPr>
+        <w:rFonts w:ascii="Courier New" w:hAnsi="Courier New" w:hint="default"/>
+        <w:sz w:val="20"/>
+      </w:rPr>
+    </w:lvl>
+    <w:lvl w:ilvl="2" w:tentative="1">
+      <w:start w:val="1"/>
+      <w:numFmt w:val="bullet"/>
+      <w:lvlText w:val=""/>
+      <w:lvlJc w:val="left"/>
+      <w:pPr>
+        <w:tabs>
+          <w:tab w:val="num" w:pos="2160"/>
+        </w:tabs>
+        <w:ind w:left="2160" w:hanging="360"/>
+      </w:pPr>
+      <w:rPr>
+        <w:rFonts w:ascii="Wingdings" w:hAnsi="Wingdings" w:hint="default"/>
+        <w:sz w:val="20"/>
+      </w:rPr>
+    </w:lvl>
+    <w:lvl w:ilvl="3" w:tentative="1">
+      <w:start w:val="1"/>
+      <w:numFmt w:val="bullet"/>
+      <w:lvlText w:val=""/>
+      <w:lvlJc w:val="left"/>
+      <w:pPr>
+        <w:tabs>
+          <w:tab w:val="num" w:pos="2880"/>
+        </w:tabs>
+        <w:ind w:left="2880" w:hanging="360"/>
+      </w:pPr>
+      <w:rPr>
+        <w:rFonts w:ascii="Wingdings" w:hAnsi="Wingdings" w:hint="default"/>
+        <w:sz w:val="20"/>
+      </w:rPr>
+    </w:lvl>
+    <w:lvl w:ilvl="4" w:tentative="1">
+      <w:start w:val="1"/>
+      <w:numFmt w:val="bullet"/>
+      <w:lvlText w:val=""/>
+      <w:lvlJc w:val="left"/>
+      <w:pPr>
+        <w:tabs>
+          <w:tab w:val="num" w:pos="3600"/>
+        </w:tabs>
+        <w:ind w:left="3600" w:hanging="360"/>
+      </w:pPr>
+      <w:rPr>
+        <w:rFonts w:ascii="Wingdings" w:hAnsi="Wingdings" w:hint="default"/>
+        <w:sz w:val="20"/>
+      </w:rPr>
+    </w:lvl>
+    <w:lvl w:ilvl="5" w:tentative="1">
+      <w:start w:val="1"/>
+      <w:numFmt w:val="bullet"/>
+      <w:lvlText w:val=""/>
+      <w:lvlJc w:val="left"/>
+      <w:pPr>
+        <w:tabs>
+          <w:tab w:val="num" w:pos="4320"/>
+        </w:tabs>
+        <w:ind w:left="4320" w:hanging="360"/>
+      </w:pPr>
+      <w:rPr>
+        <w:rFonts w:ascii="Wingdings" w:hAnsi="Wingdings" w:hint="default"/>
+        <w:sz w:val="20"/>
+      </w:rPr>
+    </w:lvl>
+    <w:lvl w:ilvl="6" w:tentative="1">
+      <w:start w:val="1"/>
+      <w:numFmt w:val="bullet"/>
+      <w:lvlText w:val=""/>
+      <w:lvlJc w:val="left"/>
+      <w:pPr>
+        <w:tabs>
+          <w:tab w:val="num" w:pos="5040"/>
+        </w:tabs>
+        <w:ind w:left="5040" w:hanging="360"/>
+      </w:pPr>
+      <w:rPr>
+        <w:rFonts w:ascii="Wingdings" w:hAnsi="Wingdings" w:hint="default"/>
+        <w:sz w:val="20"/>
+      </w:rPr>
+    </w:lvl>
+    <w:lvl w:ilvl="7" w:tentative="1">
+      <w:start w:val="1"/>
+      <w:numFmt w:val="bullet"/>
+      <w:lvlText w:val=""/>
+      <w:lvlJc w:val="left"/>
+      <w:pPr>
+        <w:tabs>
+          <w:tab w:val="num" w:pos="5760"/>
+        </w:tabs>
+        <w:ind w:left="5760" w:hanging="360"/>
+      </w:pPr>
+      <w:rPr>
+        <w:rFonts w:ascii="Wingdings" w:hAnsi="Wingdings" w:hint="default"/>
+        <w:sz w:val="20"/>
+      </w:rPr>
+    </w:lvl>
+    <w:lvl w:ilvl="8" w:tentative="1">
+      <w:start w:val="1"/>
+      <w:numFmt w:val="bullet"/>
+      <w:lvlText w:val=""/>
+      <w:lvlJc w:val="left"/>
+      <w:pPr>
+        <w:tabs>
+          <w:tab w:val="num" w:pos="6480"/>
+        </w:tabs>
+        <w:ind w:left="6480" w:hanging="360"/>
+      </w:pPr>
+      <w:rPr>
+        <w:rFonts w:ascii="Wingdings" w:hAnsi="Wingdings" w:hint="default"/>
+        <w:sz w:val="20"/>
+      </w:rPr>
+    </w:lvl>
+  </w:abstractNum>
+  <w:abstractNum w:abstractNumId="10" w15:restartNumberingAfterBreak="0">
+    <w:nsid w:val="4DAA3680"/>
+    <w:multiLevelType w:val="multilevel"/>
+    <w:tmpl w:val="244CCAB6"/>
+    <w:lvl w:ilvl="0">
+      <w:start w:val="1"/>
+      <w:numFmt w:val="bullet"/>
+      <w:lvlText w:val=""/>
+      <w:lvlJc w:val="left"/>
+      <w:pPr>
+        <w:tabs>
+          <w:tab w:val="num" w:pos="720"/>
+        </w:tabs>
+        <w:ind w:left="720" w:hanging="360"/>
+      </w:pPr>
+      <w:rPr>
+        <w:rFonts w:ascii="Symbol" w:hAnsi="Symbol" w:hint="default"/>
+        <w:sz w:val="20"/>
+      </w:rPr>
+    </w:lvl>
+    <w:lvl w:ilvl="1">
+      <w:start w:val="1"/>
+      <w:numFmt w:val="bullet"/>
+      <w:lvlText w:val="o"/>
+      <w:lvlJc w:val="left"/>
+      <w:pPr>
+        <w:tabs>
+          <w:tab w:val="num" w:pos="1440"/>
+        </w:tabs>
+        <w:ind w:left="1440" w:hanging="360"/>
+      </w:pPr>
+      <w:rPr>
+        <w:rFonts w:ascii="Courier New" w:hAnsi="Courier New" w:hint="default"/>
+        <w:sz w:val="20"/>
+      </w:rPr>
+    </w:lvl>
+    <w:lvl w:ilvl="2" w:tentative="1">
+      <w:start w:val="1"/>
+      <w:numFmt w:val="bullet"/>
+      <w:lvlText w:val=""/>
+      <w:lvlJc w:val="left"/>
+      <w:pPr>
+        <w:tabs>
+          <w:tab w:val="num" w:pos="2160"/>
+        </w:tabs>
+        <w:ind w:left="2160" w:hanging="360"/>
+      </w:pPr>
+      <w:rPr>
+        <w:rFonts w:ascii="Wingdings" w:hAnsi="Wingdings" w:hint="default"/>
+        <w:sz w:val="20"/>
+      </w:rPr>
+    </w:lvl>
+    <w:lvl w:ilvl="3" w:tentative="1">
+      <w:start w:val="1"/>
+      <w:numFmt w:val="bullet"/>
+      <w:lvlText w:val=""/>
+      <w:lvlJc w:val="left"/>
+      <w:pPr>
+        <w:tabs>
+          <w:tab w:val="num" w:pos="2880"/>
+        </w:tabs>
+        <w:ind w:left="2880" w:hanging="360"/>
+      </w:pPr>
+      <w:rPr>
+        <w:rFonts w:ascii="Wingdings" w:hAnsi="Wingdings" w:hint="default"/>
+        <w:sz w:val="20"/>
+      </w:rPr>
+    </w:lvl>
+    <w:lvl w:ilvl="4" w:tentative="1">
+      <w:start w:val="1"/>
+      <w:numFmt w:val="bullet"/>
+      <w:lvlText w:val=""/>
+      <w:lvlJc w:val="left"/>
+      <w:pPr>
+        <w:tabs>
+          <w:tab w:val="num" w:pos="3600"/>
+        </w:tabs>
+        <w:ind w:left="3600" w:hanging="360"/>
+      </w:pPr>
+      <w:rPr>
+        <w:rFonts w:ascii="Wingdings" w:hAnsi="Wingdings" w:hint="default"/>
+        <w:sz w:val="20"/>
+      </w:rPr>
+    </w:lvl>
+    <w:lvl w:ilvl="5" w:tentative="1">
+      <w:start w:val="1"/>
+      <w:numFmt w:val="bullet"/>
+      <w:lvlText w:val=""/>
+      <w:lvlJc w:val="left"/>
+      <w:pPr>
+        <w:tabs>
+          <w:tab w:val="num" w:pos="4320"/>
+        </w:tabs>
+        <w:ind w:left="4320" w:hanging="360"/>
+      </w:pPr>
+      <w:rPr>
+        <w:rFonts w:ascii="Wingdings" w:hAnsi="Wingdings" w:hint="default"/>
+        <w:sz w:val="20"/>
+      </w:rPr>
+    </w:lvl>
+    <w:lvl w:ilvl="6" w:tentative="1">
+      <w:start w:val="1"/>
+      <w:numFmt w:val="bullet"/>
+      <w:lvlText w:val=""/>
+      <w:lvlJc w:val="left"/>
+      <w:pPr>
+        <w:tabs>
+          <w:tab w:val="num" w:pos="5040"/>
+        </w:tabs>
+        <w:ind w:left="5040" w:hanging="360"/>
+      </w:pPr>
+      <w:rPr>
+        <w:rFonts w:ascii="Wingdings" w:hAnsi="Wingdings" w:hint="default"/>
+        <w:sz w:val="20"/>
+      </w:rPr>
+    </w:lvl>
+    <w:lvl w:ilvl="7" w:tentative="1">
+      <w:start w:val="1"/>
+      <w:numFmt w:val="bullet"/>
+      <w:lvlText w:val=""/>
+      <w:lvlJc w:val="left"/>
+      <w:pPr>
+        <w:tabs>
+          <w:tab w:val="num" w:pos="5760"/>
+        </w:tabs>
+        <w:ind w:left="5760" w:hanging="360"/>
+      </w:pPr>
+      <w:rPr>
+        <w:rFonts w:ascii="Wingdings" w:hAnsi="Wingdings" w:hint="default"/>
+        <w:sz w:val="20"/>
+      </w:rPr>
+    </w:lvl>
+    <w:lvl w:ilvl="8" w:tentative="1">
+      <w:start w:val="1"/>
+      <w:numFmt w:val="bullet"/>
+      <w:lvlText w:val=""/>
+      <w:lvlJc w:val="left"/>
+      <w:pPr>
+        <w:tabs>
+          <w:tab w:val="num" w:pos="6480"/>
+        </w:tabs>
+        <w:ind w:left="6480" w:hanging="360"/>
+      </w:pPr>
+      <w:rPr>
+        <w:rFonts w:ascii="Wingdings" w:hAnsi="Wingdings" w:hint="default"/>
+        <w:sz w:val="20"/>
+      </w:rPr>
+    </w:lvl>
+  </w:abstractNum>
+  <w:abstractNum w:abstractNumId="11" w15:restartNumberingAfterBreak="0">
+    <w:nsid w:val="53010F14"/>
+    <w:multiLevelType w:val="multilevel"/>
+    <w:tmpl w:val="489CD5EE"/>
+    <w:lvl w:ilvl="0">
+      <w:start w:val="1"/>
+      <w:numFmt w:val="decimal"/>
+      <w:lvlText w:val="%1."/>
+      <w:lvlJc w:val="left"/>
+      <w:pPr>
+        <w:tabs>
+          <w:tab w:val="num" w:pos="720"/>
+        </w:tabs>
+        <w:ind w:left="720" w:hanging="360"/>
+      </w:pPr>
+    </w:lvl>
+    <w:lvl w:ilvl="1">
+      <w:start w:val="1"/>
+      <w:numFmt w:val="bullet"/>
+      <w:lvlText w:val="o"/>
+      <w:lvlJc w:val="left"/>
+      <w:pPr>
+        <w:tabs>
+          <w:tab w:val="num" w:pos="1440"/>
+        </w:tabs>
+        <w:ind w:left="1440" w:hanging="360"/>
+      </w:pPr>
+      <w:rPr>
+        <w:rFonts w:ascii="Courier New" w:hAnsi="Courier New" w:hint="default"/>
+        <w:sz w:val="20"/>
+      </w:rPr>
+    </w:lvl>
+    <w:lvl w:ilvl="2">
+      <w:start w:val="1"/>
+      <w:numFmt w:val="bullet"/>
+      <w:lvlText w:val=""/>
+      <w:lvlJc w:val="left"/>
+      <w:pPr>
+        <w:tabs>
+          <w:tab w:val="num" w:pos="2160"/>
+        </w:tabs>
+        <w:ind w:left="2160" w:hanging="360"/>
+      </w:pPr>
+      <w:rPr>
+        <w:rFonts w:ascii="Wingdings" w:hAnsi="Wingdings" w:hint="default"/>
+        <w:sz w:val="20"/>
+      </w:rPr>
+    </w:lvl>
+    <w:lvl w:ilvl="3" w:tentative="1">
+      <w:start w:val="1"/>
+      <w:numFmt w:val="decimal"/>
+      <w:lvlText w:val="%4."/>
+      <w:lvlJc w:val="left"/>
+      <w:pPr>
+        <w:tabs>
+          <w:tab w:val="num" w:pos="2880"/>
+        </w:tabs>
+        <w:ind w:left="2880" w:hanging="360"/>
+      </w:pPr>
+    </w:lvl>
+    <w:lvl w:ilvl="4" w:tentative="1">
+      <w:start w:val="1"/>
+      <w:numFmt w:val="decimal"/>
+      <w:lvlText w:val="%5."/>
+      <w:lvlJc w:val="left"/>
+      <w:pPr>
+        <w:tabs>
+          <w:tab w:val="num" w:pos="3600"/>
+        </w:tabs>
+        <w:ind w:left="3600" w:hanging="360"/>
+      </w:pPr>
+    </w:lvl>
+    <w:lvl w:ilvl="5" w:tentative="1">
+      <w:start w:val="1"/>
+      <w:numFmt w:val="decimal"/>
+      <w:lvlText w:val="%6."/>
+      <w:lvlJc w:val="left"/>
+      <w:pPr>
+        <w:tabs>
+          <w:tab w:val="num" w:pos="4320"/>
+        </w:tabs>
+        <w:ind w:left="4320" w:hanging="360"/>
+      </w:pPr>
+    </w:lvl>
+    <w:lvl w:ilvl="6" w:tentative="1">
+      <w:start w:val="1"/>
+      <w:numFmt w:val="decimal"/>
+      <w:lvlText w:val="%7."/>
+      <w:lvlJc w:val="left"/>
+      <w:pPr>
+        <w:tabs>
+          <w:tab w:val="num" w:pos="5040"/>
+        </w:tabs>
+        <w:ind w:left="5040" w:hanging="360"/>
+      </w:pPr>
+    </w:lvl>
+    <w:lvl w:ilvl="7" w:tentative="1">
+      <w:start w:val="1"/>
+      <w:numFmt w:val="decimal"/>
+      <w:lvlText w:val="%8."/>
+      <w:lvlJc w:val="left"/>
+      <w:pPr>
+        <w:tabs>
+          <w:tab w:val="num" w:pos="5760"/>
+        </w:tabs>
+        <w:ind w:left="5760" w:hanging="360"/>
+      </w:pPr>
+    </w:lvl>
+    <w:lvl w:ilvl="8" w:tentative="1">
+      <w:start w:val="1"/>
+      <w:numFmt w:val="decimal"/>
+      <w:lvlText w:val="%9."/>
+      <w:lvlJc w:val="left"/>
+      <w:pPr>
+        <w:tabs>
+          <w:tab w:val="num" w:pos="6480"/>
+        </w:tabs>
+        <w:ind w:left="6480" w:hanging="360"/>
+      </w:pPr>
+    </w:lvl>
+  </w:abstractNum>
+  <w:abstractNum w:abstractNumId="12" w15:restartNumberingAfterBreak="0">
+    <w:nsid w:val="57D41A26"/>
+    <w:multiLevelType w:val="multilevel"/>
+    <w:tmpl w:val="B0A09134"/>
+    <w:lvl w:ilvl="0">
+      <w:start w:val="1"/>
+      <w:numFmt w:val="decimal"/>
+      <w:lvlText w:val="%1."/>
+      <w:lvlJc w:val="left"/>
+      <w:pPr>
+        <w:tabs>
+          <w:tab w:val="num" w:pos="720"/>
+        </w:tabs>
+        <w:ind w:left="720" w:hanging="360"/>
+      </w:pPr>
+    </w:lvl>
+    <w:lvl w:ilvl="1">
+      <w:start w:val="1"/>
+      <w:numFmt w:val="bullet"/>
+      <w:lvlText w:val="o"/>
+      <w:lvlJc w:val="left"/>
+      <w:pPr>
+        <w:tabs>
+          <w:tab w:val="num" w:pos="1440"/>
+        </w:tabs>
+        <w:ind w:left="1440" w:hanging="360"/>
+      </w:pPr>
+      <w:rPr>
+        <w:rFonts w:ascii="Courier New" w:hAnsi="Courier New" w:hint="default"/>
+        <w:sz w:val="20"/>
+      </w:rPr>
+    </w:lvl>
+    <w:lvl w:ilvl="2" w:tentative="1">
+      <w:start w:val="1"/>
+      <w:numFmt w:val="decimal"/>
+      <w:lvlText w:val="%3."/>
+      <w:lvlJc w:val="left"/>
+      <w:pPr>
+        <w:tabs>
+          <w:tab w:val="num" w:pos="2160"/>
+        </w:tabs>
+        <w:ind w:left="2160" w:hanging="360"/>
+      </w:pPr>
+    </w:lvl>
+    <w:lvl w:ilvl="3" w:tentative="1">
+      <w:start w:val="1"/>
+      <w:numFmt w:val="decimal"/>
+      <w:lvlText w:val="%4."/>
+      <w:lvlJc w:val="left"/>
+      <w:pPr>
+        <w:tabs>
+          <w:tab w:val="num" w:pos="2880"/>
+        </w:tabs>
+        <w:ind w:left="2880" w:hanging="360"/>
+      </w:pPr>
+    </w:lvl>
+    <w:lvl w:ilvl="4" w:tentative="1">
+      <w:start w:val="1"/>
+      <w:numFmt w:val="decimal"/>
+      <w:lvlText w:val="%5."/>
+      <w:lvlJc w:val="left"/>
+      <w:pPr>
+        <w:tabs>
+          <w:tab w:val="num" w:pos="3600"/>
+        </w:tabs>
+        <w:ind w:left="3600" w:hanging="360"/>
+      </w:pPr>
+    </w:lvl>
+    <w:lvl w:ilvl="5" w:tentative="1">
+      <w:start w:val="1"/>
+      <w:numFmt w:val="decimal"/>
+      <w:lvlText w:val="%6."/>
+      <w:lvlJc w:val="left"/>
+      <w:pPr>
+        <w:tabs>
+          <w:tab w:val="num" w:pos="4320"/>
+        </w:tabs>
+        <w:ind w:left="4320" w:hanging="360"/>
+      </w:pPr>
+    </w:lvl>
+    <w:lvl w:ilvl="6" w:tentative="1">
+      <w:start w:val="1"/>
+      <w:numFmt w:val="decimal"/>
+      <w:lvlText w:val="%7."/>
+      <w:lvlJc w:val="left"/>
+      <w:pPr>
+        <w:tabs>
+          <w:tab w:val="num" w:pos="5040"/>
+        </w:tabs>
+        <w:ind w:left="5040" w:hanging="360"/>
+      </w:pPr>
+    </w:lvl>
+    <w:lvl w:ilvl="7" w:tentative="1">
+      <w:start w:val="1"/>
+      <w:numFmt w:val="decimal"/>
+      <w:lvlText w:val="%8."/>
+      <w:lvlJc w:val="left"/>
+      <w:pPr>
+        <w:tabs>
+          <w:tab w:val="num" w:pos="5760"/>
+        </w:tabs>
+        <w:ind w:left="5760" w:hanging="360"/>
+      </w:pPr>
+    </w:lvl>
+    <w:lvl w:ilvl="8" w:tentative="1">
+      <w:start w:val="1"/>
+      <w:numFmt w:val="decimal"/>
+      <w:lvlText w:val="%9."/>
+      <w:lvlJc w:val="left"/>
+      <w:pPr>
+        <w:tabs>
+          <w:tab w:val="num" w:pos="6480"/>
+        </w:tabs>
+        <w:ind w:left="6480" w:hanging="360"/>
+      </w:pPr>
+    </w:lvl>
+  </w:abstractNum>
+  <w:abstractNum w:abstractNumId="13" w15:restartNumberingAfterBreak="0">
+    <w:nsid w:val="59F901D2"/>
+    <w:multiLevelType w:val="multilevel"/>
+    <w:tmpl w:val="2B4C6256"/>
+    <w:lvl w:ilvl="0">
+      <w:start w:val="1"/>
+      <w:numFmt w:val="bullet"/>
+      <w:lvlText w:val=""/>
+      <w:lvlJc w:val="left"/>
+      <w:pPr>
+        <w:tabs>
+          <w:tab w:val="num" w:pos="720"/>
+        </w:tabs>
+        <w:ind w:left="720" w:hanging="360"/>
+      </w:pPr>
+      <w:rPr>
+        <w:rFonts w:ascii="Symbol" w:hAnsi="Symbol" w:hint="default"/>
+        <w:sz w:val="20"/>
+      </w:rPr>
+    </w:lvl>
+    <w:lvl w:ilvl="1" w:tentative="1">
+      <w:start w:val="1"/>
+      <w:numFmt w:val="bullet"/>
+      <w:lvlText w:val="o"/>
+      <w:lvlJc w:val="left"/>
+      <w:pPr>
+        <w:tabs>
+          <w:tab w:val="num" w:pos="1440"/>
+        </w:tabs>
+        <w:ind w:left="1440" w:hanging="360"/>
+      </w:pPr>
+      <w:rPr>
+        <w:rFonts w:ascii="Courier New" w:hAnsi="Courier New" w:hint="default"/>
+        <w:sz w:val="20"/>
+      </w:rPr>
+    </w:lvl>
+    <w:lvl w:ilvl="2" w:tentative="1">
+      <w:start w:val="1"/>
+      <w:numFmt w:val="bullet"/>
+      <w:lvlText w:val=""/>
+      <w:lvlJc w:val="left"/>
+      <w:pPr>
+        <w:tabs>
+          <w:tab w:val="num" w:pos="2160"/>
+        </w:tabs>
+        <w:ind w:left="2160" w:hanging="360"/>
+      </w:pPr>
+      <w:rPr>
+        <w:rFonts w:ascii="Wingdings" w:hAnsi="Wingdings" w:hint="default"/>
+        <w:sz w:val="20"/>
+      </w:rPr>
+    </w:lvl>
+    <w:lvl w:ilvl="3" w:tentative="1">
+      <w:start w:val="1"/>
+      <w:numFmt w:val="bullet"/>
+      <w:lvlText w:val=""/>
+      <w:lvlJc w:val="left"/>
+      <w:pPr>
+        <w:tabs>
+          <w:tab w:val="num" w:pos="2880"/>
+        </w:tabs>
+        <w:ind w:left="2880" w:hanging="360"/>
+      </w:pPr>
+      <w:rPr>
+        <w:rFonts w:ascii="Wingdings" w:hAnsi="Wingdings" w:hint="default"/>
+        <w:sz w:val="20"/>
+      </w:rPr>
+    </w:lvl>
+    <w:lvl w:ilvl="4" w:tentative="1">
+      <w:start w:val="1"/>
+      <w:numFmt w:val="bullet"/>
+      <w:lvlText w:val=""/>
+      <w:lvlJc w:val="left"/>
+      <w:pPr>
+        <w:tabs>
+          <w:tab w:val="num" w:pos="3600"/>
+        </w:tabs>
+        <w:ind w:left="3600" w:hanging="360"/>
+      </w:pPr>
+      <w:rPr>
+        <w:rFonts w:ascii="Wingdings" w:hAnsi="Wingdings" w:hint="default"/>
+        <w:sz w:val="20"/>
+      </w:rPr>
+    </w:lvl>
+    <w:lvl w:ilvl="5" w:tentative="1">
+      <w:start w:val="1"/>
+      <w:numFmt w:val="bullet"/>
+      <w:lvlText w:val=""/>
+      <w:lvlJc w:val="left"/>
+      <w:pPr>
+        <w:tabs>
+          <w:tab w:val="num" w:pos="4320"/>
+        </w:tabs>
+        <w:ind w:left="4320" w:hanging="360"/>
+      </w:pPr>
+      <w:rPr>
+        <w:rFonts w:ascii="Wingdings" w:hAnsi="Wingdings" w:hint="default"/>
+        <w:sz w:val="20"/>
+      </w:rPr>
+    </w:lvl>
+    <w:lvl w:ilvl="6" w:tentative="1">
+      <w:start w:val="1"/>
+      <w:numFmt w:val="bullet"/>
+      <w:lvlText w:val=""/>
+      <w:lvlJc w:val="left"/>
+      <w:pPr>
+        <w:tabs>
+          <w:tab w:val="num" w:pos="5040"/>
+        </w:tabs>
+        <w:ind w:left="5040" w:hanging="360"/>
+      </w:pPr>
+      <w:rPr>
+        <w:rFonts w:ascii="Wingdings" w:hAnsi="Wingdings" w:hint="default"/>
+        <w:sz w:val="20"/>
+      </w:rPr>
+    </w:lvl>
+    <w:lvl w:ilvl="7" w:tentative="1">
+      <w:start w:val="1"/>
+      <w:numFmt w:val="bullet"/>
+      <w:lvlText w:val=""/>
+      <w:lvlJc w:val="left"/>
+      <w:pPr>
+        <w:tabs>
+          <w:tab w:val="num" w:pos="5760"/>
+        </w:tabs>
+        <w:ind w:left="5760" w:hanging="360"/>
+      </w:pPr>
+      <w:rPr>
+        <w:rFonts w:ascii="Wingdings" w:hAnsi="Wingdings" w:hint="default"/>
+        <w:sz w:val="20"/>
+      </w:rPr>
+    </w:lvl>
+    <w:lvl w:ilvl="8" w:tentative="1">
+      <w:start w:val="1"/>
+      <w:numFmt w:val="bullet"/>
+      <w:lvlText w:val=""/>
+      <w:lvlJc w:val="left"/>
+      <w:pPr>
+        <w:tabs>
+          <w:tab w:val="num" w:pos="6480"/>
+        </w:tabs>
+        <w:ind w:left="6480" w:hanging="360"/>
+      </w:pPr>
+      <w:rPr>
+        <w:rFonts w:ascii="Wingdings" w:hAnsi="Wingdings" w:hint="default"/>
+        <w:sz w:val="20"/>
+      </w:rPr>
+    </w:lvl>
+  </w:abstractNum>
+  <w:abstractNum w:abstractNumId="14" w15:restartNumberingAfterBreak="0">
+    <w:nsid w:val="5CE57840"/>
+    <w:multiLevelType w:val="multilevel"/>
+    <w:tmpl w:val="26F6F5C6"/>
+    <w:lvl w:ilvl="0">
+      <w:start w:val="1"/>
+      <w:numFmt w:val="bullet"/>
+      <w:lvlText w:val=""/>
+      <w:lvlJc w:val="left"/>
+      <w:pPr>
+        <w:tabs>
+          <w:tab w:val="num" w:pos="720"/>
+        </w:tabs>
+        <w:ind w:left="720" w:hanging="360"/>
+      </w:pPr>
+      <w:rPr>
+        <w:rFonts w:ascii="Symbol" w:hAnsi="Symbol" w:hint="default"/>
+        <w:sz w:val="20"/>
+      </w:rPr>
+    </w:lvl>
+    <w:lvl w:ilvl="1" w:tentative="1">
+      <w:start w:val="1"/>
+      <w:numFmt w:val="bullet"/>
+      <w:lvlText w:val="o"/>
+      <w:lvlJc w:val="left"/>
+      <w:pPr>
+        <w:tabs>
+          <w:tab w:val="num" w:pos="1440"/>
+        </w:tabs>
+        <w:ind w:left="1440" w:hanging="360"/>
+      </w:pPr>
+      <w:rPr>
+        <w:rFonts w:ascii="Courier New" w:hAnsi="Courier New" w:hint="default"/>
+        <w:sz w:val="20"/>
+      </w:rPr>
+    </w:lvl>
+    <w:lvl w:ilvl="2" w:tentative="1">
+      <w:start w:val="1"/>
+      <w:numFmt w:val="bullet"/>
+      <w:lvlText w:val=""/>
+      <w:lvlJc w:val="left"/>
+      <w:pPr>
+        <w:tabs>
+          <w:tab w:val="num" w:pos="2160"/>
+        </w:tabs>
+        <w:ind w:left="2160" w:hanging="360"/>
+      </w:pPr>
+      <w:rPr>
+        <w:rFonts w:ascii="Wingdings" w:hAnsi="Wingdings" w:hint="default"/>
+        <w:sz w:val="20"/>
+      </w:rPr>
+    </w:lvl>
+    <w:lvl w:ilvl="3" w:tentative="1">
+      <w:start w:val="1"/>
+      <w:numFmt w:val="bullet"/>
+      <w:lvlText w:val=""/>
+      <w:lvlJc w:val="left"/>
+      <w:pPr>
+        <w:tabs>
+          <w:tab w:val="num" w:pos="2880"/>
+        </w:tabs>
+        <w:ind w:left="2880" w:hanging="360"/>
+      </w:pPr>
+      <w:rPr>
+        <w:rFonts w:ascii="Wingdings" w:hAnsi="Wingdings" w:hint="default"/>
+        <w:sz w:val="20"/>
+      </w:rPr>
+    </w:lvl>
+    <w:lvl w:ilvl="4" w:tentative="1">
+      <w:start w:val="1"/>
+      <w:numFmt w:val="bullet"/>
+      <w:lvlText w:val=""/>
+      <w:lvlJc w:val="left"/>
+      <w:pPr>
+        <w:tabs>
+          <w:tab w:val="num" w:pos="3600"/>
+        </w:tabs>
+        <w:ind w:left="3600" w:hanging="360"/>
+      </w:pPr>
+      <w:rPr>
+        <w:rFonts w:ascii="Wingdings" w:hAnsi="Wingdings" w:hint="default"/>
+        <w:sz w:val="20"/>
+      </w:rPr>
+    </w:lvl>
+    <w:lvl w:ilvl="5" w:tentative="1">
+      <w:start w:val="1"/>
+      <w:numFmt w:val="bullet"/>
+      <w:lvlText w:val=""/>
+      <w:lvlJc w:val="left"/>
+      <w:pPr>
+        <w:tabs>
+          <w:tab w:val="num" w:pos="4320"/>
+        </w:tabs>
+        <w:ind w:left="4320" w:hanging="360"/>
+      </w:pPr>
+      <w:rPr>
+        <w:rFonts w:ascii="Wingdings" w:hAnsi="Wingdings" w:hint="default"/>
+        <w:sz w:val="20"/>
+      </w:rPr>
+    </w:lvl>
+    <w:lvl w:ilvl="6" w:tentative="1">
+      <w:start w:val="1"/>
+      <w:numFmt w:val="bullet"/>
+      <w:lvlText w:val=""/>
+      <w:lvlJc w:val="left"/>
+      <w:pPr>
+        <w:tabs>
+          <w:tab w:val="num" w:pos="5040"/>
+        </w:tabs>
+        <w:ind w:left="5040" w:hanging="360"/>
+      </w:pPr>
+      <w:rPr>
+        <w:rFonts w:ascii="Wingdings" w:hAnsi="Wingdings" w:hint="default"/>
+        <w:sz w:val="20"/>
+      </w:rPr>
+    </w:lvl>
+    <w:lvl w:ilvl="7" w:tentative="1">
+      <w:start w:val="1"/>
+      <w:numFmt w:val="bullet"/>
+      <w:lvlText w:val=""/>
+      <w:lvlJc w:val="left"/>
+      <w:pPr>
+        <w:tabs>
+          <w:tab w:val="num" w:pos="5760"/>
+        </w:tabs>
+        <w:ind w:left="5760" w:hanging="360"/>
+      </w:pPr>
+      <w:rPr>
+        <w:rFonts w:ascii="Wingdings" w:hAnsi="Wingdings" w:hint="default"/>
+        <w:sz w:val="20"/>
+      </w:rPr>
+    </w:lvl>
+    <w:lvl w:ilvl="8" w:tentative="1">
+      <w:start w:val="1"/>
+      <w:numFmt w:val="bullet"/>
+      <w:lvlText w:val=""/>
+      <w:lvlJc w:val="left"/>
+      <w:pPr>
+        <w:tabs>
+          <w:tab w:val="num" w:pos="6480"/>
+        </w:tabs>
+        <w:ind w:left="6480" w:hanging="360"/>
+      </w:pPr>
+      <w:rPr>
+        <w:rFonts w:ascii="Wingdings" w:hAnsi="Wingdings" w:hint="default"/>
+        <w:sz w:val="20"/>
+      </w:rPr>
+    </w:lvl>
+  </w:abstractNum>
+  <w:abstractNum w:abstractNumId="15" w15:restartNumberingAfterBreak="0">
+    <w:nsid w:val="68637910"/>
+    <w:multiLevelType w:val="multilevel"/>
+    <w:tmpl w:val="76A6299C"/>
+    <w:lvl w:ilvl="0">
+      <w:start w:val="1"/>
+      <w:numFmt w:val="bullet"/>
+      <w:lvlText w:val=""/>
+      <w:lvlJc w:val="left"/>
+      <w:pPr>
+        <w:tabs>
+          <w:tab w:val="num" w:pos="720"/>
+        </w:tabs>
+        <w:ind w:left="720" w:hanging="360"/>
+      </w:pPr>
+      <w:rPr>
+        <w:rFonts w:ascii="Symbol" w:hAnsi="Symbol" w:hint="default"/>
+        <w:sz w:val="20"/>
+      </w:rPr>
+    </w:lvl>
+    <w:lvl w:ilvl="1" w:tentative="1">
+      <w:start w:val="1"/>
+      <w:numFmt w:val="bullet"/>
+      <w:lvlText w:val="o"/>
+      <w:lvlJc w:val="left"/>
+      <w:pPr>
+        <w:tabs>
+          <w:tab w:val="num" w:pos="1440"/>
+        </w:tabs>
+        <w:ind w:left="1440" w:hanging="360"/>
+      </w:pPr>
+      <w:rPr>
+        <w:rFonts w:ascii="Courier New" w:hAnsi="Courier New" w:hint="default"/>
+        <w:sz w:val="20"/>
+      </w:rPr>
+    </w:lvl>
+    <w:lvl w:ilvl="2" w:tentative="1">
+      <w:start w:val="1"/>
+      <w:numFmt w:val="bullet"/>
+      <w:lvlText w:val=""/>
+      <w:lvlJc w:val="left"/>
+      <w:pPr>
+        <w:tabs>
+          <w:tab w:val="num" w:pos="2160"/>
+        </w:tabs>
+        <w:ind w:left="2160" w:hanging="360"/>
+      </w:pPr>
+      <w:rPr>
+        <w:rFonts w:ascii="Wingdings" w:hAnsi="Wingdings" w:hint="default"/>
+        <w:sz w:val="20"/>
+      </w:rPr>
+    </w:lvl>
+    <w:lvl w:ilvl="3" w:tentative="1">
+      <w:start w:val="1"/>
+      <w:numFmt w:val="bullet"/>
+      <w:lvlText w:val=""/>
+      <w:lvlJc w:val="left"/>
+      <w:pPr>
+        <w:tabs>
+          <w:tab w:val="num" w:pos="2880"/>
+        </w:tabs>
+        <w:ind w:left="2880" w:hanging="360"/>
+      </w:pPr>
+      <w:rPr>
+        <w:rFonts w:ascii="Wingdings" w:hAnsi="Wingdings" w:hint="default"/>
+        <w:sz w:val="20"/>
+      </w:rPr>
+    </w:lvl>
+    <w:lvl w:ilvl="4" w:tentative="1">
+      <w:start w:val="1"/>
+      <w:numFmt w:val="bullet"/>
+      <w:lvlText w:val=""/>
+      <w:lvlJc w:val="left"/>
+      <w:pPr>
+        <w:tabs>
+          <w:tab w:val="num" w:pos="3600"/>
+        </w:tabs>
+        <w:ind w:left="3600" w:hanging="360"/>
+      </w:pPr>
+      <w:rPr>
+        <w:rFonts w:ascii="Wingdings" w:hAnsi="Wingdings" w:hint="default"/>
+        <w:sz w:val="20"/>
+      </w:rPr>
+    </w:lvl>
+    <w:lvl w:ilvl="5" w:tentative="1">
+      <w:start w:val="1"/>
+      <w:numFmt w:val="bullet"/>
+      <w:lvlText w:val=""/>
+      <w:lvlJc w:val="left"/>
+      <w:pPr>
+        <w:tabs>
+          <w:tab w:val="num" w:pos="4320"/>
+        </w:tabs>
+        <w:ind w:left="4320" w:hanging="360"/>
+      </w:pPr>
+      <w:rPr>
+        <w:rFonts w:ascii="Wingdings" w:hAnsi="Wingdings" w:hint="default"/>
+        <w:sz w:val="20"/>
+      </w:rPr>
+    </w:lvl>
+    <w:lvl w:ilvl="6" w:tentative="1">
+      <w:start w:val="1"/>
+      <w:numFmt w:val="bullet"/>
+      <w:lvlText w:val=""/>
+      <w:lvlJc w:val="left"/>
+      <w:pPr>
+        <w:tabs>
+          <w:tab w:val="num" w:pos="5040"/>
+        </w:tabs>
+        <w:ind w:left="5040" w:hanging="360"/>
+      </w:pPr>
+      <w:rPr>
+        <w:rFonts w:ascii="Wingdings" w:hAnsi="Wingdings" w:hint="default"/>
+        <w:sz w:val="20"/>
+      </w:rPr>
+    </w:lvl>
+    <w:lvl w:ilvl="7" w:tentative="1">
+      <w:start w:val="1"/>
+      <w:numFmt w:val="bullet"/>
+      <w:lvlText w:val=""/>
+      <w:lvlJc w:val="left"/>
+      <w:pPr>
+        <w:tabs>
+          <w:tab w:val="num" w:pos="5760"/>
+        </w:tabs>
+        <w:ind w:left="5760" w:hanging="360"/>
+      </w:pPr>
+      <w:rPr>
+        <w:rFonts w:ascii="Wingdings" w:hAnsi="Wingdings" w:hint="default"/>
+        <w:sz w:val="20"/>
+      </w:rPr>
+    </w:lvl>
+    <w:lvl w:ilvl="8" w:tentative="1">
+      <w:start w:val="1"/>
+      <w:numFmt w:val="bullet"/>
+      <w:lvlText w:val=""/>
+      <w:lvlJc w:val="left"/>
+      <w:pPr>
+        <w:tabs>
+          <w:tab w:val="num" w:pos="6480"/>
+        </w:tabs>
+        <w:ind w:left="6480" w:hanging="360"/>
+      </w:pPr>
+      <w:rPr>
+        <w:rFonts w:ascii="Wingdings" w:hAnsi="Wingdings" w:hint="default"/>
+        <w:sz w:val="20"/>
+      </w:rPr>
+    </w:lvl>
+  </w:abstractNum>
+  <w:abstractNum w:abstractNumId="16" w15:restartNumberingAfterBreak="0">
+    <w:nsid w:val="68C47672"/>
+    <w:multiLevelType w:val="multilevel"/>
+    <w:tmpl w:val="AAF88D24"/>
+    <w:lvl w:ilvl="0">
+      <w:start w:val="1"/>
+      <w:numFmt w:val="bullet"/>
+      <w:lvlText w:val=""/>
+      <w:lvlJc w:val="left"/>
+      <w:pPr>
+        <w:tabs>
+          <w:tab w:val="num" w:pos="720"/>
+        </w:tabs>
+        <w:ind w:left="720" w:hanging="360"/>
+      </w:pPr>
+      <w:rPr>
+        <w:rFonts w:ascii="Symbol" w:hAnsi="Symbol" w:hint="default"/>
+        <w:sz w:val="20"/>
+      </w:rPr>
+    </w:lvl>
+    <w:lvl w:ilvl="1">
+      <w:start w:val="1"/>
+      <w:numFmt w:val="bullet"/>
+      <w:lvlText w:val="o"/>
+      <w:lvlJc w:val="left"/>
+      <w:pPr>
+        <w:tabs>
+          <w:tab w:val="num" w:pos="1440"/>
+        </w:tabs>
+        <w:ind w:left="1440" w:hanging="360"/>
+      </w:pPr>
+      <w:rPr>
+        <w:rFonts w:ascii="Courier New" w:hAnsi="Courier New" w:hint="default"/>
+        <w:sz w:val="20"/>
+      </w:rPr>
+    </w:lvl>
+    <w:lvl w:ilvl="2" w:tentative="1">
+      <w:start w:val="1"/>
+      <w:numFmt w:val="bullet"/>
+      <w:lvlText w:val=""/>
+      <w:lvlJc w:val="left"/>
+      <w:pPr>
+        <w:tabs>
+          <w:tab w:val="num" w:pos="2160"/>
+        </w:tabs>
+        <w:ind w:left="2160" w:hanging="360"/>
+      </w:pPr>
+      <w:rPr>
+        <w:rFonts w:ascii="Wingdings" w:hAnsi="Wingdings" w:hint="default"/>
+        <w:sz w:val="20"/>
+      </w:rPr>
+    </w:lvl>
+    <w:lvl w:ilvl="3" w:tentative="1">
+      <w:start w:val="1"/>
+      <w:numFmt w:val="bullet"/>
+      <w:lvlText w:val=""/>
+      <w:lvlJc w:val="left"/>
+      <w:pPr>
+        <w:tabs>
+          <w:tab w:val="num" w:pos="2880"/>
+        </w:tabs>
+        <w:ind w:left="2880" w:hanging="360"/>
+      </w:pPr>
+      <w:rPr>
+        <w:rFonts w:ascii="Wingdings" w:hAnsi="Wingdings" w:hint="default"/>
+        <w:sz w:val="20"/>
+      </w:rPr>
+    </w:lvl>
+    <w:lvl w:ilvl="4" w:tentative="1">
+      <w:start w:val="1"/>
+      <w:numFmt w:val="bullet"/>
+      <w:lvlText w:val=""/>
+      <w:lvlJc w:val="left"/>
+      <w:pPr>
+        <w:tabs>
+          <w:tab w:val="num" w:pos="3600"/>
+        </w:tabs>
+        <w:ind w:left="3600" w:hanging="360"/>
+      </w:pPr>
+      <w:rPr>
+        <w:rFonts w:ascii="Wingdings" w:hAnsi="Wingdings" w:hint="default"/>
+        <w:sz w:val="20"/>
+      </w:rPr>
+    </w:lvl>
+    <w:lvl w:ilvl="5" w:tentative="1">
+      <w:start w:val="1"/>
+      <w:numFmt w:val="bullet"/>
+      <w:lvlText w:val=""/>
+      <w:lvlJc w:val="left"/>
+      <w:pPr>
+        <w:tabs>
+          <w:tab w:val="num" w:pos="4320"/>
+        </w:tabs>
+        <w:ind w:left="4320" w:hanging="360"/>
+      </w:pPr>
+      <w:rPr>
+        <w:rFonts w:ascii="Wingdings" w:hAnsi="Wingdings" w:hint="default"/>
+        <w:sz w:val="20"/>
+      </w:rPr>
+    </w:lvl>
+    <w:lvl w:ilvl="6" w:tentative="1">
+      <w:start w:val="1"/>
+      <w:numFmt w:val="bullet"/>
+      <w:lvlText w:val=""/>
+      <w:lvlJc w:val="left"/>
+      <w:pPr>
+        <w:tabs>
+          <w:tab w:val="num" w:pos="5040"/>
+        </w:tabs>
+        <w:ind w:left="5040" w:hanging="360"/>
+      </w:pPr>
+      <w:rPr>
+        <w:rFonts w:ascii="Wingdings" w:hAnsi="Wingdings" w:hint="default"/>
+        <w:sz w:val="20"/>
+      </w:rPr>
+    </w:lvl>
+    <w:lvl w:ilvl="7" w:tentative="1">
+      <w:start w:val="1"/>
+      <w:numFmt w:val="bullet"/>
+      <w:lvlText w:val=""/>
+      <w:lvlJc w:val="left"/>
+      <w:pPr>
+        <w:tabs>
+          <w:tab w:val="num" w:pos="5760"/>
+        </w:tabs>
+        <w:ind w:left="5760" w:hanging="360"/>
+      </w:pPr>
+      <w:rPr>
+        <w:rFonts w:ascii="Wingdings" w:hAnsi="Wingdings" w:hint="default"/>
+        <w:sz w:val="20"/>
+      </w:rPr>
+    </w:lvl>
+    <w:lvl w:ilvl="8" w:tentative="1">
+      <w:start w:val="1"/>
+      <w:numFmt w:val="bullet"/>
+      <w:lvlText w:val=""/>
+      <w:lvlJc w:val="left"/>
+      <w:pPr>
+        <w:tabs>
+          <w:tab w:val="num" w:pos="6480"/>
+        </w:tabs>
+        <w:ind w:left="6480" w:hanging="360"/>
+      </w:pPr>
+      <w:rPr>
+        <w:rFonts w:ascii="Wingdings" w:hAnsi="Wingdings" w:hint="default"/>
+        <w:sz w:val="20"/>
+      </w:rPr>
+    </w:lvl>
+  </w:abstractNum>
+  <w:abstractNum w:abstractNumId="17" w15:restartNumberingAfterBreak="0">
+    <w:nsid w:val="771B0A1E"/>
+    <w:multiLevelType w:val="multilevel"/>
+    <w:tmpl w:val="838E740E"/>
+    <w:lvl w:ilvl="0">
+      <w:start w:val="1"/>
+      <w:numFmt w:val="bullet"/>
+      <w:lvlText w:val=""/>
+      <w:lvlJc w:val="left"/>
+      <w:pPr>
+        <w:tabs>
+          <w:tab w:val="num" w:pos="720"/>
+        </w:tabs>
+        <w:ind w:left="720" w:hanging="360"/>
+      </w:pPr>
+      <w:rPr>
+        <w:rFonts w:ascii="Symbol" w:hAnsi="Symbol" w:hint="default"/>
+        <w:sz w:val="20"/>
+      </w:rPr>
+    </w:lvl>
+    <w:lvl w:ilvl="1" w:tentative="1">
+      <w:start w:val="1"/>
+      <w:numFmt w:val="bullet"/>
+      <w:lvlText w:val="o"/>
+      <w:lvlJc w:val="left"/>
+      <w:pPr>
+        <w:tabs>
+          <w:tab w:val="num" w:pos="1440"/>
+        </w:tabs>
+        <w:ind w:left="1440" w:hanging="360"/>
+      </w:pPr>
+      <w:rPr>
+        <w:rFonts w:ascii="Courier New" w:hAnsi="Courier New" w:hint="default"/>
+        <w:sz w:val="20"/>
+      </w:rPr>
+    </w:lvl>
+    <w:lvl w:ilvl="2" w:tentative="1">
+      <w:start w:val="1"/>
+      <w:numFmt w:val="bullet"/>
+      <w:lvlText w:val=""/>
+      <w:lvlJc w:val="left"/>
+      <w:pPr>
+        <w:tabs>
+          <w:tab w:val="num" w:pos="2160"/>
+        </w:tabs>
+        <w:ind w:left="2160" w:hanging="360"/>
+      </w:pPr>
+      <w:rPr>
+        <w:rFonts w:ascii="Wingdings" w:hAnsi="Wingdings" w:hint="default"/>
+        <w:sz w:val="20"/>
+      </w:rPr>
+    </w:lvl>
+    <w:lvl w:ilvl="3" w:tentative="1">
+      <w:start w:val="1"/>
+      <w:numFmt w:val="bullet"/>
+      <w:lvlText w:val=""/>
+      <w:lvlJc w:val="left"/>
+      <w:pPr>
+        <w:tabs>
+          <w:tab w:val="num" w:pos="2880"/>
+        </w:tabs>
+        <w:ind w:left="2880" w:hanging="360"/>
+      </w:pPr>
+      <w:rPr>
+        <w:rFonts w:ascii="Wingdings" w:hAnsi="Wingdings" w:hint="default"/>
+        <w:sz w:val="20"/>
+      </w:rPr>
+    </w:lvl>
+    <w:lvl w:ilvl="4" w:tentative="1">
+      <w:start w:val="1"/>
+      <w:numFmt w:val="bullet"/>
+      <w:lvlText w:val=""/>
+      <w:lvlJc w:val="left"/>
+      <w:pPr>
+        <w:tabs>
+          <w:tab w:val="num" w:pos="3600"/>
+        </w:tabs>
+        <w:ind w:left="3600" w:hanging="360"/>
+      </w:pPr>
+      <w:rPr>
+        <w:rFonts w:ascii="Wingdings" w:hAnsi="Wingdings" w:hint="default"/>
+        <w:sz w:val="20"/>
+      </w:rPr>
+    </w:lvl>
+    <w:lvl w:ilvl="5" w:tentative="1">
+      <w:start w:val="1"/>
+      <w:numFmt w:val="bullet"/>
+      <w:lvlText w:val=""/>
+      <w:lvlJc w:val="left"/>
+      <w:pPr>
+        <w:tabs>
+          <w:tab w:val="num" w:pos="4320"/>
+        </w:tabs>
+        <w:ind w:left="4320" w:hanging="360"/>
+      </w:pPr>
+      <w:rPr>
+        <w:rFonts w:ascii="Wingdings" w:hAnsi="Wingdings" w:hint="default"/>
+        <w:sz w:val="20"/>
+      </w:rPr>
+    </w:lvl>
+    <w:lvl w:ilvl="6" w:tentative="1">
+      <w:start w:val="1"/>
+      <w:numFmt w:val="bullet"/>
+      <w:lvlText w:val=""/>
+      <w:lvlJc w:val="left"/>
+      <w:pPr>
+        <w:tabs>
+          <w:tab w:val="num" w:pos="5040"/>
+        </w:tabs>
+        <w:ind w:left="5040" w:hanging="360"/>
+      </w:pPr>
+      <w:rPr>
+        <w:rFonts w:ascii="Wingdings" w:hAnsi="Wingdings" w:hint="default"/>
+        <w:sz w:val="20"/>
+      </w:rPr>
+    </w:lvl>
+    <w:lvl w:ilvl="7" w:tentative="1">
+      <w:start w:val="1"/>
+      <w:numFmt w:val="bullet"/>
+      <w:lvlText w:val=""/>
+      <w:lvlJc w:val="left"/>
+      <w:pPr>
+        <w:tabs>
+          <w:tab w:val="num" w:pos="5760"/>
+        </w:tabs>
+        <w:ind w:left="5760" w:hanging="360"/>
+      </w:pPr>
+      <w:rPr>
+        <w:rFonts w:ascii="Wingdings" w:hAnsi="Wingdings" w:hint="default"/>
+        <w:sz w:val="20"/>
+      </w:rPr>
+    </w:lvl>
+    <w:lvl w:ilvl="8" w:tentative="1">
+      <w:start w:val="1"/>
+      <w:numFmt w:val="bullet"/>
+      <w:lvlText w:val=""/>
+      <w:lvlJc w:val="left"/>
+      <w:pPr>
+        <w:tabs>
+          <w:tab w:val="num" w:pos="6480"/>
+        </w:tabs>
+        <w:ind w:left="6480" w:hanging="360"/>
+      </w:pPr>
+      <w:rPr>
+        <w:rFonts w:ascii="Wingdings" w:hAnsi="Wingdings" w:hint="default"/>
+        <w:sz w:val="20"/>
+      </w:rPr>
+    </w:lvl>
+  </w:abstractNum>
+  <w:abstractNum w:abstractNumId="18" w15:restartNumberingAfterBreak="0">
+    <w:nsid w:val="79CD7093"/>
+    <w:multiLevelType w:val="multilevel"/>
+    <w:tmpl w:val="E8FEF41C"/>
+    <w:lvl w:ilvl="0">
+      <w:start w:val="1"/>
+      <w:numFmt w:val="bullet"/>
+      <w:lvlText w:val=""/>
+      <w:lvlJc w:val="left"/>
+      <w:pPr>
+        <w:tabs>
+          <w:tab w:val="num" w:pos="720"/>
+        </w:tabs>
+        <w:ind w:left="720" w:hanging="360"/>
+      </w:pPr>
+      <w:rPr>
+        <w:rFonts w:ascii="Symbol" w:hAnsi="Symbol" w:hint="default"/>
+        <w:sz w:val="20"/>
+      </w:rPr>
+    </w:lvl>
+    <w:lvl w:ilvl="1">
+      <w:start w:val="1"/>
+      <w:numFmt w:val="bullet"/>
+      <w:lvlText w:val="o"/>
+      <w:lvlJc w:val="left"/>
+      <w:pPr>
+        <w:tabs>
+          <w:tab w:val="num" w:pos="1440"/>
+        </w:tabs>
+        <w:ind w:left="1440" w:hanging="360"/>
+      </w:pPr>
+      <w:rPr>
+        <w:rFonts w:ascii="Courier New" w:hAnsi="Courier New" w:hint="default"/>
+        <w:sz w:val="20"/>
+      </w:rPr>
+    </w:lvl>
+    <w:lvl w:ilvl="2" w:tentative="1">
+      <w:start w:val="1"/>
+      <w:numFmt w:val="bullet"/>
+      <w:lvlText w:val=""/>
+      <w:lvlJc w:val="left"/>
+      <w:pPr>
+        <w:tabs>
+          <w:tab w:val="num" w:pos="2160"/>
+        </w:tabs>
+        <w:ind w:left="2160" w:hanging="360"/>
+      </w:pPr>
+      <w:rPr>
+        <w:rFonts w:ascii="Wingdings" w:hAnsi="Wingdings" w:hint="default"/>
+        <w:sz w:val="20"/>
+      </w:rPr>
+    </w:lvl>
+    <w:lvl w:ilvl="3" w:tentative="1">
+      <w:start w:val="1"/>
+      <w:numFmt w:val="bullet"/>
+      <w:lvlText w:val=""/>
+      <w:lvlJc w:val="left"/>
+      <w:pPr>
+        <w:tabs>
+          <w:tab w:val="num" w:pos="2880"/>
+        </w:tabs>
+        <w:ind w:left="2880" w:hanging="360"/>
+      </w:pPr>
+      <w:rPr>
+        <w:rFonts w:ascii="Wingdings" w:hAnsi="Wingdings" w:hint="default"/>
+        <w:sz w:val="20"/>
+      </w:rPr>
+    </w:lvl>
+    <w:lvl w:ilvl="4" w:tentative="1">
+      <w:start w:val="1"/>
+      <w:numFmt w:val="bullet"/>
+      <w:lvlText w:val=""/>
+      <w:lvlJc w:val="left"/>
+      <w:pPr>
+        <w:tabs>
+          <w:tab w:val="num" w:pos="3600"/>
+        </w:tabs>
+        <w:ind w:left="3600" w:hanging="360"/>
+      </w:pPr>
+      <w:rPr>
+        <w:rFonts w:ascii="Wingdings" w:hAnsi="Wingdings" w:hint="default"/>
+        <w:sz w:val="20"/>
+      </w:rPr>
+    </w:lvl>
+    <w:lvl w:ilvl="5" w:tentative="1">
+      <w:start w:val="1"/>
+      <w:numFmt w:val="bullet"/>
+      <w:lvlText w:val=""/>
+      <w:lvlJc w:val="left"/>
+      <w:pPr>
+        <w:tabs>
+          <w:tab w:val="num" w:pos="4320"/>
+        </w:tabs>
+        <w:ind w:left="4320" w:hanging="360"/>
+      </w:pPr>
+      <w:rPr>
+        <w:rFonts w:ascii="Wingdings" w:hAnsi="Wingdings" w:hint="default"/>
+        <w:sz w:val="20"/>
+      </w:rPr>
+    </w:lvl>
+    <w:lvl w:ilvl="6" w:tentative="1">
+      <w:start w:val="1"/>
+      <w:numFmt w:val="bullet"/>
+      <w:lvlText w:val=""/>
+      <w:lvlJc w:val="left"/>
+      <w:pPr>
+        <w:tabs>
+          <w:tab w:val="num" w:pos="5040"/>
+        </w:tabs>
+        <w:ind w:left="5040" w:hanging="360"/>
+      </w:pPr>
+      <w:rPr>
+        <w:rFonts w:ascii="Wingdings" w:hAnsi="Wingdings" w:hint="default"/>
+        <w:sz w:val="20"/>
+      </w:rPr>
+    </w:lvl>
+    <w:lvl w:ilvl="7" w:tentative="1">
+      <w:start w:val="1"/>
+      <w:numFmt w:val="bullet"/>
+      <w:lvlText w:val=""/>
+      <w:lvlJc w:val="left"/>
+      <w:pPr>
+        <w:tabs>
+          <w:tab w:val="num" w:pos="5760"/>
+        </w:tabs>
+        <w:ind w:left="5760" w:hanging="360"/>
+      </w:pPr>
+      <w:rPr>
+        <w:rFonts w:ascii="Wingdings" w:hAnsi="Wingdings" w:hint="default"/>
+        <w:sz w:val="20"/>
+      </w:rPr>
+    </w:lvl>
+    <w:lvl w:ilvl="8" w:tentative="1">
+      <w:start w:val="1"/>
+      <w:numFmt w:val="bullet"/>
+      <w:lvlText w:val=""/>
+      <w:lvlJc w:val="left"/>
+      <w:pPr>
+        <w:tabs>
+          <w:tab w:val="num" w:pos="6480"/>
+        </w:tabs>
+        <w:ind w:left="6480" w:hanging="360"/>
+      </w:pPr>
+      <w:rPr>
+        <w:rFonts w:ascii="Wingdings" w:hAnsi="Wingdings" w:hint="default"/>
+        <w:sz w:val="20"/>
+      </w:rPr>
+    </w:lvl>
+  </w:abstractNum>
+  <w:abstractNum w:abstractNumId="19" w15:restartNumberingAfterBreak="0">
     <w:nsid w:val="7A4C102E"/>
     <w:multiLevelType w:val="multilevel"/>
     <w:tmpl w:val="E14CD152"/>
@@ -830,16 +4454,64 @@
     </w:lvl>
   </w:abstractNum>
   <w:num w:numId="1" w16cid:durableId="2007439249">
+    <w:abstractNumId w:val="19"/>
+  </w:num>
+  <w:num w:numId="2" w16cid:durableId="562300057">
+    <w:abstractNumId w:val="8"/>
+  </w:num>
+  <w:num w:numId="3" w16cid:durableId="1735935641">
+    <w:abstractNumId w:val="1"/>
+  </w:num>
+  <w:num w:numId="4" w16cid:durableId="579948052">
+    <w:abstractNumId w:val="4"/>
+  </w:num>
+  <w:num w:numId="5" w16cid:durableId="1424834947">
+    <w:abstractNumId w:val="11"/>
+  </w:num>
+  <w:num w:numId="6" w16cid:durableId="195896819">
     <w:abstractNumId w:val="3"/>
   </w:num>
-  <w:num w:numId="2" w16cid:durableId="562300057">
+  <w:num w:numId="7" w16cid:durableId="907031533">
     <w:abstractNumId w:val="2"/>
   </w:num>
-  <w:num w:numId="3" w16cid:durableId="1735935641">
+  <w:num w:numId="8" w16cid:durableId="2057923494">
+    <w:abstractNumId w:val="9"/>
+  </w:num>
+  <w:num w:numId="9" w16cid:durableId="1775636866">
+    <w:abstractNumId w:val="7"/>
+  </w:num>
+  <w:num w:numId="10" w16cid:durableId="669993018">
+    <w:abstractNumId w:val="10"/>
+  </w:num>
+  <w:num w:numId="11" w16cid:durableId="605305829">
+    <w:abstractNumId w:val="16"/>
+  </w:num>
+  <w:num w:numId="12" w16cid:durableId="1469783285">
+    <w:abstractNumId w:val="17"/>
+  </w:num>
+  <w:num w:numId="13" w16cid:durableId="1090198464">
+    <w:abstractNumId w:val="5"/>
+  </w:num>
+  <w:num w:numId="14" w16cid:durableId="873351261">
+    <w:abstractNumId w:val="14"/>
+  </w:num>
+  <w:num w:numId="15" w16cid:durableId="42411176">
+    <w:abstractNumId w:val="12"/>
+  </w:num>
+  <w:num w:numId="16" w16cid:durableId="1371373267">
+    <w:abstractNumId w:val="15"/>
+  </w:num>
+  <w:num w:numId="17" w16cid:durableId="970480740">
     <w:abstractNumId w:val="0"/>
   </w:num>
-  <w:num w:numId="4" w16cid:durableId="579948052">
-    <w:abstractNumId w:val="1"/>
+  <w:num w:numId="18" w16cid:durableId="1986280998">
+    <w:abstractNumId w:val="6"/>
+  </w:num>
+  <w:num w:numId="19" w16cid:durableId="923686282">
+    <w:abstractNumId w:val="18"/>
+  </w:num>
+  <w:num w:numId="20" w16cid:durableId="1871338025">
+    <w:abstractNumId w:val="13"/>
   </w:num>
 </w:numbering>
 </file>
@@ -1759,6 +5431,29 @@
       <w:spacing w:val="5"/>
     </w:rPr>
   </w:style>
+  <w:style w:type="character" w:styleId="Hyperlink">
+    <w:name w:val="Hyperlink"/>
+    <w:basedOn w:val="DefaultParagraphFont"/>
+    <w:uiPriority w:val="99"/>
+    <w:unhideWhenUsed/>
+    <w:rsid w:val="00A9662B"/>
+    <w:rPr>
+      <w:color w:val="467886" w:themeColor="hyperlink"/>
+      <w:u w:val="single"/>
+    </w:rPr>
+  </w:style>
+  <w:style w:type="character" w:styleId="UnresolvedMention">
+    <w:name w:val="Unresolved Mention"/>
+    <w:basedOn w:val="DefaultParagraphFont"/>
+    <w:uiPriority w:val="99"/>
+    <w:semiHidden/>
+    <w:unhideWhenUsed/>
+    <w:rsid w:val="00A9662B"/>
+    <w:rPr>
+      <w:color w:val="605E5C"/>
+      <w:shd w:val="clear" w:color="auto" w:fill="E1DFDD"/>
+    </w:rPr>
+  </w:style>
 </w:styles>
 </file>
 

</xml_diff>